<commit_message>
Schritt 5: anspruchsvolle freiwillige Papierprojekte und Vertiefungen
</commit_message>
<xml_diff>
--- a/materialien/projekte/Freiwillige_Projekte_Wunschbriefe_DIN_A5.docx
+++ b/materialien/projekte/Freiwillige_Projekte_Wunschbriefe_DIN_A5.docx
@@ -4,168 +4,11 @@
   <w:body>
     <w:p>
       <w:pPr>
-        <w:spacing w:after="60"/>
-        <w:jc w:val="center"/>
+        <w:pStyle w:val="Title"/>
+        <w:pageBreakBefore w:val="0"/>
       </w:pPr>
       <w:r>
-        <w:rPr>
-          <w:b/>
-          <w:color w:val="3E5668"/>
-          <w:sz w:val="40"/>
-        </w:rPr>
         <w:t>Freiwillige Projekte</w:t>
-      </w:r>
-    </w:p>
-    <w:p>
-      <w:pPr>
-        <w:spacing w:after="100"/>
-        <w:jc w:val="center"/>
-      </w:pPr>
-      <w:r>
-        <w:rPr>
-          <w:color w:val="D97A4A"/>
-          <w:sz w:val="19"/>
-        </w:rPr>
-        <w:t>Lernweg: Input → Übung → Vertiefung → Probearbeit → Projekte → Lernerfolgskontrolle (Arbeit)</w:t>
-      </w:r>
-    </w:p>
-    <w:tbl>
-      <w:tblPr>
-        <w:tblW w:type="auto" w:w="0"/>
-        <w:jc w:val="center"/>
-        <w:tblLook w:firstColumn="1" w:firstRow="1" w:lastColumn="0" w:lastRow="0" w:noHBand="0" w:noVBand="1" w:val="04A0"/>
-      </w:tblPr>
-      <w:tblGrid>
-        <w:gridCol w:w="7483"/>
-      </w:tblGrid>
-      <w:tr>
-        <w:tc>
-          <w:tcPr>
-            <w:tcW w:type="dxa" w:w="7483"/>
-            <w:shd w:fill="EDF5EA"/>
-            <w:tcMar>
-              <w:top w:w="80" w:type="dxa"/>
-              <w:start w:w="100" w:type="dxa"/>
-              <w:bottom w:w="80" w:type="dxa"/>
-              <w:end w:w="100" w:type="dxa"/>
-            </w:tcMar>
-          </w:tcPr>
-          <w:p>
-            <w:pPr>
-              <w:spacing w:after="0"/>
-            </w:pPr>
-            <w:r>
-              <w:rPr>
-                <w:b/>
-                <w:color w:val="4D8B3F"/>
-                <w:sz w:val="19"/>
-              </w:rPr>
-              <w:t>Wichtig</w:t>
-            </w:r>
-            <w:r>
-              <w:br/>
-              <w:t>Projekte sind freiwillig. Du kannst ein Projekt bearbeiten, wenn du die grundlegenden Übungen abgeschlossen hast und weiterarbeiten möchtest.</w:t>
-            </w:r>
-          </w:p>
-        </w:tc>
-      </w:tr>
-    </w:tbl>
-    <w:p>
-      <w:pPr>
-        <w:spacing w:after="20"/>
-      </w:pPr>
-    </w:p>
-    <w:p>
-      <w:pPr>
-        <w:pStyle w:val="Heading1"/>
-      </w:pPr>
-      <w:r>
-        <w:t>So arbeitest du</w:t>
-      </w:r>
-    </w:p>
-    <w:p>
-      <w:pPr>
-        <w:spacing w:after="20" w:line="240" w:lineRule="auto"/>
-      </w:pPr>
-      <w:r>
-        <w:rPr>
-          <w:b/>
-        </w:rPr>
-        <w:t xml:space="preserve">• </w:t>
-      </w:r>
-      <w:r>
-        <w:rPr>
-          <w:sz w:val="20"/>
-        </w:rPr>
-        <w:t>Wähle ein Projekt, das dich interessiert.</w:t>
-      </w:r>
-    </w:p>
-    <w:p>
-      <w:pPr>
-        <w:spacing w:after="20" w:line="240" w:lineRule="auto"/>
-      </w:pPr>
-      <w:r>
-        <w:rPr>
-          <w:b/>
-        </w:rPr>
-        <w:t xml:space="preserve">• </w:t>
-      </w:r>
-      <w:r>
-        <w:rPr>
-          <w:sz w:val="20"/>
-        </w:rPr>
-        <w:t>Besprich deine Wahl kurz mit einer Lehrkraft.</w:t>
-      </w:r>
-    </w:p>
-    <w:p>
-      <w:pPr>
-        <w:spacing w:after="20" w:line="240" w:lineRule="auto"/>
-      </w:pPr>
-      <w:r>
-        <w:rPr>
-          <w:b/>
-        </w:rPr>
-        <w:t xml:space="preserve">• </w:t>
-      </w:r>
-      <w:r>
-        <w:rPr>
-          <w:sz w:val="20"/>
-        </w:rPr>
-        <w:t>Arbeite mit Planung – Durchführung – Reflexion.</w:t>
-      </w:r>
-    </w:p>
-    <w:p>
-      <w:pPr>
-        <w:spacing w:after="20" w:line="240" w:lineRule="auto"/>
-      </w:pPr>
-      <w:r>
-        <w:rPr>
-          <w:b/>
-        </w:rPr>
-        <w:t xml:space="preserve">• </w:t>
-      </w:r>
-      <w:r>
-        <w:rPr>
-          <w:sz w:val="20"/>
-        </w:rPr>
-        <w:t>Du kannst allein oder nach Absprache im Team arbeiten.</w:t>
-      </w:r>
-    </w:p>
-    <w:p>
-      <w:pPr>
-        <w:spacing w:after="20" w:line="240" w:lineRule="auto"/>
-      </w:pPr>
-      <w:r>
-        <w:rPr>
-          <w:b/>
-        </w:rPr>
-        <w:t xml:space="preserve">• </w:t>
-      </w:r>
-      <w:r>
-        <w:rPr>
-          <w:sz w:val="20"/>
-        </w:rPr>
-        <w:t>Ein Projekt ersetzt nicht die Probearbeit oder die Lernerfolgskontrolle.</w:t>
       </w:r>
     </w:p>
     <w:p>
@@ -173,2549 +16,763 @@
         <w:pStyle w:val="Heading1"/>
       </w:pPr>
       <w:r>
-        <w:t>Die sechs Projekte</w:t>
+        <w:t>Wähle, was dich interessiert</w:t>
+      </w:r>
+    </w:p>
+    <w:p>
+      <w:r>
+        <w:t>Nach der Probearbeit kannst du ein Projekt wählen. Es ist freiwillig. Es ersetzt weder die Probearbeit noch die Arbeit.</w:t>
       </w:r>
     </w:p>
     <w:p>
       <w:pPr>
-        <w:spacing w:after="20" w:line="240" w:lineRule="auto"/>
+        <w:shd w:fill="EEF2F4"/>
       </w:pPr>
       <w:r>
         <w:rPr>
           <w:b/>
         </w:rPr>
-        <w:t xml:space="preserve">• </w:t>
+        <w:t>Dein Weg</w:t>
+        <w:br/>
       </w:r>
       <w:r>
+        <w:t>Input → Übung → Vertiefung → Probearbeit → Projekte → Lernerfolgskontrolle (Arbeit)</w:t>
+      </w:r>
+    </w:p>
+    <w:p>
+      <w:r>
+        <w:t>1  Ein echter Wunschbrief</w:t>
+      </w:r>
+    </w:p>
+    <w:p>
+      <w:r>
+        <w:t>2  Eine Umfrage prüfen und nutzen</w:t>
+      </w:r>
+    </w:p>
+    <w:p>
+      <w:r>
+        <w:t>3  Eine Idee für einen Schulort</w:t>
+      </w:r>
+    </w:p>
+    <w:p>
+      <w:r>
+        <w:t>4  Ein verständliches Wunschposter</w:t>
+      </w:r>
+    </w:p>
+    <w:p>
+      <w:r>
+        <w:t>5  Zwei Briefe, zwei Empfänger</w:t>
+      </w:r>
+    </w:p>
+    <w:p>
+      <w:r>
+        <w:t>6  Auf eine Antwort reagieren</w:t>
+      </w:r>
+    </w:p>
+    <w:p>
+      <w:r>
+        <w:t>Besprich deine Wahl mit der Lehrkraft. Du kannst allein oder nach Absprache mit einem Partnerkind arbeiten.</w:t>
+      </w:r>
+    </w:p>
+    <w:p>
+      <w:pPr>
+        <w:shd w:fill="EEF2F4"/>
+      </w:pPr>
+      <w:r>
         <w:rPr>
-          <w:sz w:val="19"/>
+          <w:b/>
         </w:rPr>
+        <w:t>Du brauchst Papier</w:t>
+        <w:br/>
+      </w:r>
+      <w:r>
+        <w:t>Arbeite im Heft oder auf Papier. Alle Projekte gehen ohne Laptop. Für Projekt 2 und 4 liegt eine Datenkarte bei.</w:t>
+      </w:r>
+    </w:p>
+    <w:p>
+      <w:r>
+        <w:t>Hilfen sind erlaubt. Die besonderen Projektaufträge gelten nur für dein gewähltes Projekt. Sie sind keine neuen Pflichtanforderungen für die Arbeit.</w:t>
+      </w:r>
+    </w:p>
+    <w:p>
+      <w:pPr>
+        <w:pStyle w:val="Title"/>
+        <w:pageBreakBefore/>
+      </w:pPr>
+      <w:r>
+        <w:t>Projekt 1 · freiwillig</w:t>
+      </w:r>
+    </w:p>
+    <w:p>
+      <w:pPr>
+        <w:pStyle w:val="Heading1"/>
+      </w:pPr>
+      <w:r>
         <w:t>Ein echter Wunschbrief</w:t>
       </w:r>
     </w:p>
     <w:p>
       <w:pPr>
-        <w:spacing w:after="20" w:line="240" w:lineRule="auto"/>
+        <w:shd w:fill="EEF2F4"/>
       </w:pPr>
       <w:r>
         <w:rPr>
           <w:b/>
         </w:rPr>
-        <w:t xml:space="preserve">• </w:t>
+        <w:t>Dein Ergebnis</w:t>
+        <w:br/>
       </w:r>
       <w:r>
-        <w:rPr>
-          <w:sz w:val="19"/>
-        </w:rPr>
-        <w:t>Unsere Umfrage wird zum Argument</w:t>
-      </w:r>
-    </w:p>
-    <w:p>
-      <w:pPr>
-        <w:spacing w:after="20" w:line="240" w:lineRule="auto"/>
-      </w:pPr>
-      <w:r>
-        <w:rPr>
-          <w:b/>
-        </w:rPr>
-        <w:t xml:space="preserve">• </w:t>
-      </w:r>
-      <w:r>
-        <w:rPr>
-          <w:sz w:val="19"/>
-        </w:rPr>
-        <w:t>Verbesserungsidee für einen Schulort</w:t>
-      </w:r>
-    </w:p>
-    <w:p>
-      <w:pPr>
-        <w:spacing w:after="20" w:line="240" w:lineRule="auto"/>
-      </w:pPr>
-      <w:r>
-        <w:rPr>
-          <w:b/>
-        </w:rPr>
-        <w:t xml:space="preserve">• </w:t>
-      </w:r>
-      <w:r>
-        <w:rPr>
-          <w:sz w:val="19"/>
-        </w:rPr>
-        <w:t>Ausstellungsposter: Das wünschen wir uns</w:t>
-      </w:r>
-    </w:p>
-    <w:p>
-      <w:pPr>
-        <w:spacing w:after="20" w:line="240" w:lineRule="auto"/>
-      </w:pPr>
-      <w:r>
-        <w:rPr>
-          <w:b/>
-        </w:rPr>
-        <w:t xml:space="preserve">• </w:t>
-      </w:r>
-      <w:r>
-        <w:rPr>
-          <w:sz w:val="19"/>
-        </w:rPr>
-        <w:t>Zwei Briefe, zwei Empfänger</w:t>
-      </w:r>
-    </w:p>
-    <w:p>
-      <w:pPr>
-        <w:spacing w:after="20" w:line="240" w:lineRule="auto"/>
-      </w:pPr>
-      <w:r>
-        <w:rPr>
-          <w:b/>
-        </w:rPr>
-        <w:t xml:space="preserve">• </w:t>
-      </w:r>
-      <w:r>
-        <w:rPr>
-          <w:sz w:val="19"/>
-        </w:rPr>
-        <w:t>Digitaler Wunschbrief</w:t>
+        <w:t>Ein Brief mit einem begründeten Vorschlag.</w:t>
       </w:r>
     </w:p>
     <w:p>
       <w:r>
-        <w:br w:type="page"/>
+        <w:t>Material: Heft, Briefpapier, Merkblätter 2 und 4.</w:t>
       </w:r>
-    </w:p>
-    <w:p>
-      <w:pPr>
-        <w:spacing w:after="20"/>
-        <w:jc w:val="center"/>
-      </w:pPr>
-      <w:r>
-        <w:rPr>
-          <w:b/>
-          <w:color w:val="3E5668"/>
-          <w:sz w:val="29"/>
-        </w:rPr>
-        <w:t>Projekt 1 – Ein echter Wunschbrief</w:t>
-      </w:r>
-    </w:p>
-    <w:p>
-      <w:pPr>
-        <w:spacing w:after="80"/>
-        <w:jc w:val="center"/>
-      </w:pPr>
-      <w:r>
-        <w:rPr>
-          <w:i/>
-          <w:color w:val="D97A4A"/>
-          <w:sz w:val="17"/>
-        </w:rPr>
-        <w:t>Freiwilliges Projekt</w:t>
-      </w:r>
-    </w:p>
-    <w:tbl>
-      <w:tblPr>
-        <w:tblW w:type="auto" w:w="0"/>
-        <w:jc w:val="center"/>
-        <w:tblLook w:firstColumn="1" w:firstRow="1" w:lastColumn="0" w:lastRow="0" w:noHBand="0" w:noVBand="1" w:val="04A0"/>
-      </w:tblPr>
-      <w:tblGrid>
-        <w:gridCol w:w="7483"/>
-      </w:tblGrid>
-      <w:tr>
-        <w:tc>
-          <w:tcPr>
-            <w:tcW w:type="dxa" w:w="7483"/>
-            <w:shd w:fill="FBF5E2"/>
-            <w:tcMar>
-              <w:top w:w="80" w:type="dxa"/>
-              <w:start w:w="100" w:type="dxa"/>
-              <w:bottom w:w="80" w:type="dxa"/>
-              <w:end w:w="100" w:type="dxa"/>
-            </w:tcMar>
-          </w:tcPr>
-          <w:p>
-            <w:pPr>
-              <w:spacing w:after="0"/>
-            </w:pPr>
-            <w:r>
-              <w:rPr>
-                <w:b/>
-                <w:color w:val="C17B00"/>
-                <w:sz w:val="19"/>
-              </w:rPr>
-              <w:t>Dein Produkt</w:t>
-            </w:r>
-            <w:r>
-              <w:br/>
-              <w:t>Du schreibst einen echten Wunschbrief an eine passende Person oder Stelle der Schule.</w:t>
-            </w:r>
-          </w:p>
-        </w:tc>
-      </w:tr>
-    </w:tbl>
-    <w:p>
-      <w:pPr>
-        <w:spacing w:after="20"/>
-      </w:pPr>
-    </w:p>
-    <w:tbl>
-      <w:tblPr>
-        <w:tblW w:type="auto" w:w="0"/>
-        <w:jc w:val="center"/>
-        <w:tblLook w:firstColumn="1" w:firstRow="1" w:lastColumn="0" w:lastRow="0" w:noHBand="0" w:noVBand="1" w:val="04A0"/>
-      </w:tblPr>
-      <w:tblGrid>
-        <w:gridCol w:w="7483"/>
-      </w:tblGrid>
-      <w:tr>
-        <w:tc>
-          <w:tcPr>
-            <w:tcW w:type="dxa" w:w="7483"/>
-            <w:shd w:fill="EEF2F4"/>
-            <w:tcMar>
-              <w:top w:w="45" w:type="dxa"/>
-              <w:start w:w="70" w:type="dxa"/>
-              <w:bottom w:w="45" w:type="dxa"/>
-              <w:end w:w="70" w:type="dxa"/>
-            </w:tcMar>
-          </w:tcPr>
-          <w:p>
-            <w:pPr>
-              <w:spacing w:after="0"/>
-            </w:pPr>
-            <w:r>
-              <w:rPr>
-                <w:b/>
-                <w:color w:val="3E5668"/>
-              </w:rPr>
-              <w:t>Planung</w:t>
-            </w:r>
-            <w:r>
-              <w:rPr>
-                <w:sz w:val="17"/>
-              </w:rPr>
-              <w:br/>
-              <w:t>• Wähle einen realistischen Wunsch.</w:t>
-            </w:r>
-            <w:r>
-              <w:rPr>
-                <w:sz w:val="17"/>
-              </w:rPr>
-              <w:br/>
-              <w:t>• Bestimme eine passende Ansprechperson.</w:t>
-            </w:r>
-            <w:r>
-              <w:rPr>
-                <w:sz w:val="17"/>
-              </w:rPr>
-              <w:br/>
-              <w:t>• Prüfe, ob Umfragedaten zu deinem Wunsch passen.</w:t>
-            </w:r>
-          </w:p>
-        </w:tc>
-      </w:tr>
-    </w:tbl>
-    <w:p>
-      <w:pPr>
-        <w:spacing w:after="0"/>
-      </w:pPr>
-    </w:p>
-    <w:tbl>
-      <w:tblPr>
-        <w:tblW w:type="auto" w:w="0"/>
-        <w:jc w:val="center"/>
-        <w:tblLook w:firstColumn="1" w:firstRow="1" w:lastColumn="0" w:lastRow="0" w:noHBand="0" w:noVBand="1" w:val="04A0"/>
-      </w:tblPr>
-      <w:tblGrid>
-        <w:gridCol w:w="7483"/>
-      </w:tblGrid>
-      <w:tr>
-        <w:tc>
-          <w:tcPr>
-            <w:tcW w:type="dxa" w:w="7483"/>
-            <w:shd w:fill="F8EEE7"/>
-            <w:tcMar>
-              <w:top w:w="45" w:type="dxa"/>
-              <w:start w:w="70" w:type="dxa"/>
-              <w:bottom w:w="45" w:type="dxa"/>
-              <w:end w:w="70" w:type="dxa"/>
-            </w:tcMar>
-          </w:tcPr>
-          <w:p>
-            <w:pPr>
-              <w:spacing w:after="0"/>
-            </w:pPr>
-            <w:r>
-              <w:rPr>
-                <w:b/>
-                <w:color w:val="D97A4A"/>
-              </w:rPr>
-              <w:t>Durchführung</w:t>
-            </w:r>
-            <w:r>
-              <w:rPr>
-                <w:sz w:val="17"/>
-              </w:rPr>
-              <w:br/>
-              <w:t>• Plane deinen Brief mit Stichwörtern.</w:t>
-            </w:r>
-            <w:r>
-              <w:rPr>
-                <w:sz w:val="17"/>
-              </w:rPr>
-              <w:br/>
-              <w:t>• Schreibe freundlich und verständlich.</w:t>
-            </w:r>
-            <w:r>
-              <w:rPr>
-                <w:sz w:val="17"/>
-              </w:rPr>
-              <w:br/>
-              <w:t>• Nutze bei Bedarf ein Umfrageergebnis als Argument.</w:t>
-            </w:r>
-            <w:r>
-              <w:rPr>
-                <w:sz w:val="17"/>
-              </w:rPr>
-              <w:br/>
-              <w:t>• Überarbeite den Brief mit der Checkliste.</w:t>
-            </w:r>
-          </w:p>
-        </w:tc>
-      </w:tr>
-    </w:tbl>
-    <w:p>
-      <w:pPr>
-        <w:spacing w:after="0"/>
-      </w:pPr>
-    </w:p>
-    <w:tbl>
-      <w:tblPr>
-        <w:tblW w:type="auto" w:w="0"/>
-        <w:jc w:val="center"/>
-        <w:tblLook w:firstColumn="1" w:firstRow="1" w:lastColumn="0" w:lastRow="0" w:noHBand="0" w:noVBand="1" w:val="04A0"/>
-      </w:tblPr>
-      <w:tblGrid>
-        <w:gridCol w:w="7483"/>
-      </w:tblGrid>
-      <w:tr>
-        <w:tc>
-          <w:tcPr>
-            <w:tcW w:type="dxa" w:w="7483"/>
-            <w:shd w:fill="EDF5EA"/>
-            <w:tcMar>
-              <w:top w:w="45" w:type="dxa"/>
-              <w:start w:w="70" w:type="dxa"/>
-              <w:bottom w:w="45" w:type="dxa"/>
-              <w:end w:w="70" w:type="dxa"/>
-            </w:tcMar>
-          </w:tcPr>
-          <w:p>
-            <w:pPr>
-              <w:spacing w:after="0"/>
-            </w:pPr>
-            <w:r>
-              <w:rPr>
-                <w:b/>
-                <w:color w:val="4D8B3F"/>
-              </w:rPr>
-              <w:t>Reflexion</w:t>
-            </w:r>
-            <w:r>
-              <w:rPr>
-                <w:sz w:val="17"/>
-              </w:rPr>
-              <w:br/>
-              <w:t>• Was ist besonders überzeugend?</w:t>
-            </w:r>
-            <w:r>
-              <w:rPr>
-                <w:sz w:val="17"/>
-              </w:rPr>
-              <w:br/>
-              <w:t>• Welche Stelle hast du verbessert?</w:t>
-            </w:r>
-            <w:r>
-              <w:rPr>
-                <w:sz w:val="17"/>
-              </w:rPr>
-              <w:br/>
-              <w:t>• Soll der Brief wirklich abgegeben werden?</w:t>
-            </w:r>
-          </w:p>
-        </w:tc>
-      </w:tr>
-    </w:tbl>
-    <w:p>
-      <w:pPr>
-        <w:spacing w:after="0"/>
-      </w:pPr>
     </w:p>
     <w:p>
       <w:pPr>
         <w:pStyle w:val="Heading2"/>
       </w:pPr>
       <w:r>
-        <w:t>Das soll dein Ergebnis können</w:t>
+        <w:t>Planung</w:t>
       </w:r>
     </w:p>
     <w:p>
-      <w:pPr>
-        <w:spacing w:after="20" w:line="240" w:lineRule="auto"/>
-      </w:pPr>
       <w:r>
-        <w:rPr>
-          <w:b/>
-        </w:rPr>
-        <w:t xml:space="preserve">• </w:t>
+        <w:t>Wähle einen Schulwunsch und eine passende Person. Sammle zwei Gründe. Entscheide, welcher für diese Person wichtiger ist.</w:t>
       </w:r>
-      <w:r>
-        <w:rPr>
-          <w:sz w:val="17"/>
-        </w:rPr>
-        <w:t>vollständiger Briefaufbau</w:t>
-      </w:r>
-    </w:p>
-    <w:p>
-      <w:pPr>
-        <w:spacing w:after="20" w:line="240" w:lineRule="auto"/>
-      </w:pPr>
-      <w:r>
-        <w:rPr>
-          <w:b/>
-        </w:rPr>
-        <w:t xml:space="preserve">• </w:t>
-      </w:r>
-      <w:r>
-        <w:rPr>
-          <w:sz w:val="17"/>
-        </w:rPr>
-        <w:t>klarer und freundlicher Wunsch</w:t>
-      </w:r>
-    </w:p>
-    <w:p>
-      <w:pPr>
-        <w:spacing w:after="20" w:line="240" w:lineRule="auto"/>
-      </w:pPr>
-      <w:r>
-        <w:rPr>
-          <w:b/>
-        </w:rPr>
-        <w:t xml:space="preserve">• </w:t>
-      </w:r>
-      <w:r>
-        <w:rPr>
-          <w:sz w:val="17"/>
-        </w:rPr>
-        <w:t>mindestens ein passender Grund</w:t>
-      </w:r>
-    </w:p>
-    <w:p>
-      <w:pPr>
-        <w:spacing w:after="20" w:line="240" w:lineRule="auto"/>
-      </w:pPr>
-      <w:r>
-        <w:rPr>
-          <w:b/>
-        </w:rPr>
-        <w:t xml:space="preserve">• </w:t>
-      </w:r>
-      <w:r>
-        <w:rPr>
-          <w:sz w:val="17"/>
-        </w:rPr>
-        <w:t>passender Empfänger</w:t>
-      </w:r>
-    </w:p>
-    <w:p>
-      <w:pPr>
-        <w:spacing w:after="20" w:line="240" w:lineRule="auto"/>
-      </w:pPr>
-      <w:r>
-        <w:rPr>
-          <w:b/>
-        </w:rPr>
-        <w:t xml:space="preserve">• </w:t>
-      </w:r>
-      <w:r>
-        <w:rPr>
-          <w:sz w:val="17"/>
-        </w:rPr>
-        <w:t>sorgfältig überarbeitet</w:t>
-      </w:r>
-    </w:p>
-    <w:tbl>
-      <w:tblPr>
-        <w:tblW w:type="auto" w:w="0"/>
-        <w:jc w:val="center"/>
-        <w:tblLook w:firstColumn="1" w:firstRow="1" w:lastColumn="0" w:lastRow="0" w:noHBand="0" w:noVBand="1" w:val="04A0"/>
-      </w:tblPr>
-      <w:tblGrid>
-        <w:gridCol w:w="7483"/>
-      </w:tblGrid>
-      <w:tr>
-        <w:tc>
-          <w:tcPr>
-            <w:tcW w:type="dxa" w:w="7483"/>
-            <w:shd w:fill="EEF2F4"/>
-            <w:tcMar>
-              <w:top w:w="80" w:type="dxa"/>
-              <w:start w:w="100" w:type="dxa"/>
-              <w:bottom w:w="80" w:type="dxa"/>
-              <w:end w:w="100" w:type="dxa"/>
-            </w:tcMar>
-          </w:tcPr>
-          <w:p>
-            <w:pPr>
-              <w:spacing w:after="0"/>
-            </w:pPr>
-            <w:r>
-              <w:rPr>
-                <w:b/>
-                <w:color w:val="3E5668"/>
-                <w:sz w:val="19"/>
-              </w:rPr>
-              <w:t>Du kannst nutzen</w:t>
-            </w:r>
-            <w:r>
-              <w:br/>
-              <w:t>Merkblätter, Kontroll-Kiosk, Ergebnisse aus Mathematik, Laptop zum Tippen</w:t>
-            </w:r>
-          </w:p>
-        </w:tc>
-      </w:tr>
-    </w:tbl>
-    <w:p>
-      <w:pPr>
-        <w:spacing w:after="20"/>
-      </w:pPr>
-    </w:p>
-    <w:p>
-      <w:r>
-        <w:br w:type="page"/>
-      </w:r>
-    </w:p>
-    <w:p>
-      <w:pPr>
-        <w:spacing w:after="20"/>
-        <w:jc w:val="center"/>
-      </w:pPr>
-      <w:r>
-        <w:rPr>
-          <w:b/>
-          <w:color w:val="3E5668"/>
-          <w:sz w:val="29"/>
-        </w:rPr>
-        <w:t>Projekt 2 – Unsere Umfrage wird zum Argument</w:t>
-      </w:r>
-    </w:p>
-    <w:p>
-      <w:pPr>
-        <w:spacing w:after="80"/>
-        <w:jc w:val="center"/>
-      </w:pPr>
-      <w:r>
-        <w:rPr>
-          <w:i/>
-          <w:color w:val="D97A4A"/>
-          <w:sz w:val="17"/>
-        </w:rPr>
-        <w:t>Freiwilliges Projekt</w:t>
-      </w:r>
-    </w:p>
-    <w:tbl>
-      <w:tblPr>
-        <w:tblW w:type="auto" w:w="0"/>
-        <w:jc w:val="center"/>
-        <w:tblLook w:firstColumn="1" w:firstRow="1" w:lastColumn="0" w:lastRow="0" w:noHBand="0" w:noVBand="1" w:val="04A0"/>
-      </w:tblPr>
-      <w:tblGrid>
-        <w:gridCol w:w="7483"/>
-      </w:tblGrid>
-      <w:tr>
-        <w:tc>
-          <w:tcPr>
-            <w:tcW w:type="dxa" w:w="7483"/>
-            <w:shd w:fill="FBF5E2"/>
-            <w:tcMar>
-              <w:top w:w="80" w:type="dxa"/>
-              <w:start w:w="100" w:type="dxa"/>
-              <w:bottom w:w="80" w:type="dxa"/>
-              <w:end w:w="100" w:type="dxa"/>
-            </w:tcMar>
-          </w:tcPr>
-          <w:p>
-            <w:pPr>
-              <w:spacing w:after="0"/>
-            </w:pPr>
-            <w:r>
-              <w:rPr>
-                <w:b/>
-                <w:color w:val="C17B00"/>
-                <w:sz w:val="19"/>
-              </w:rPr>
-              <w:t>Dein Produkt</w:t>
-            </w:r>
-            <w:r>
-              <w:br/>
-              <w:t>Du wählst ein echtes Umfrageergebnis aus Mathematik und entwickelst daraus einen begründeten Wunsch.</w:t>
-            </w:r>
-          </w:p>
-        </w:tc>
-      </w:tr>
-    </w:tbl>
-    <w:p>
-      <w:pPr>
-        <w:spacing w:after="20"/>
-      </w:pPr>
-    </w:p>
-    <w:tbl>
-      <w:tblPr>
-        <w:tblW w:type="auto" w:w="0"/>
-        <w:jc w:val="center"/>
-        <w:tblLook w:firstColumn="1" w:firstRow="1" w:lastColumn="0" w:lastRow="0" w:noHBand="0" w:noVBand="1" w:val="04A0"/>
-      </w:tblPr>
-      <w:tblGrid>
-        <w:gridCol w:w="7483"/>
-      </w:tblGrid>
-      <w:tr>
-        <w:tc>
-          <w:tcPr>
-            <w:tcW w:type="dxa" w:w="7483"/>
-            <w:shd w:fill="EEF2F4"/>
-            <w:tcMar>
-              <w:top w:w="45" w:type="dxa"/>
-              <w:start w:w="70" w:type="dxa"/>
-              <w:bottom w:w="45" w:type="dxa"/>
-              <w:end w:w="70" w:type="dxa"/>
-            </w:tcMar>
-          </w:tcPr>
-          <w:p>
-            <w:pPr>
-              <w:spacing w:after="0"/>
-            </w:pPr>
-            <w:r>
-              <w:rPr>
-                <w:b/>
-                <w:color w:val="3E5668"/>
-              </w:rPr>
-              <w:t>Planung</w:t>
-            </w:r>
-            <w:r>
-              <w:rPr>
-                <w:sz w:val="17"/>
-              </w:rPr>
-              <w:br/>
-              <w:t>• Wähle ein Diagramm oder eine Tabelle.</w:t>
-            </w:r>
-            <w:r>
-              <w:rPr>
-                <w:sz w:val="17"/>
-              </w:rPr>
-              <w:br/>
-              <w:t>• Lies die wichtigsten Werte ab.</w:t>
-            </w:r>
-            <w:r>
-              <w:rPr>
-                <w:sz w:val="17"/>
-              </w:rPr>
-              <w:br/>
-              <w:t>• Entscheide, welcher Wunsch dazu passt.</w:t>
-            </w:r>
-          </w:p>
-        </w:tc>
-      </w:tr>
-    </w:tbl>
-    <w:p>
-      <w:pPr>
-        <w:spacing w:after="0"/>
-      </w:pPr>
-    </w:p>
-    <w:tbl>
-      <w:tblPr>
-        <w:tblW w:type="auto" w:w="0"/>
-        <w:jc w:val="center"/>
-        <w:tblLook w:firstColumn="1" w:firstRow="1" w:lastColumn="0" w:lastRow="0" w:noHBand="0" w:noVBand="1" w:val="04A0"/>
-      </w:tblPr>
-      <w:tblGrid>
-        <w:gridCol w:w="7483"/>
-      </w:tblGrid>
-      <w:tr>
-        <w:tc>
-          <w:tcPr>
-            <w:tcW w:type="dxa" w:w="7483"/>
-            <w:shd w:fill="F8EEE7"/>
-            <w:tcMar>
-              <w:top w:w="45" w:type="dxa"/>
-              <w:start w:w="70" w:type="dxa"/>
-              <w:bottom w:w="45" w:type="dxa"/>
-              <w:end w:w="70" w:type="dxa"/>
-            </w:tcMar>
-          </w:tcPr>
-          <w:p>
-            <w:pPr>
-              <w:spacing w:after="0"/>
-            </w:pPr>
-            <w:r>
-              <w:rPr>
-                <w:b/>
-                <w:color w:val="D97A4A"/>
-              </w:rPr>
-              <w:t>Durchführung</w:t>
-            </w:r>
-            <w:r>
-              <w:rPr>
-                <w:sz w:val="17"/>
-              </w:rPr>
-              <w:br/>
-              <w:t>• Formuliere mindestens zwei korrekte Datensätze.</w:t>
-            </w:r>
-            <w:r>
-              <w:rPr>
-                <w:sz w:val="17"/>
-              </w:rPr>
-              <w:br/>
-              <w:t>• Erkläre, warum das Ergebnis wichtig ist.</w:t>
-            </w:r>
-            <w:r>
-              <w:rPr>
-                <w:sz w:val="17"/>
-              </w:rPr>
-              <w:br/>
-              <w:t>• Baue einen Datensatz in einen kurzen Wunschbrief ein.</w:t>
-            </w:r>
-          </w:p>
-        </w:tc>
-      </w:tr>
-    </w:tbl>
-    <w:p>
-      <w:pPr>
-        <w:spacing w:after="0"/>
-      </w:pPr>
-    </w:p>
-    <w:tbl>
-      <w:tblPr>
-        <w:tblW w:type="auto" w:w="0"/>
-        <w:jc w:val="center"/>
-        <w:tblLook w:firstColumn="1" w:firstRow="1" w:lastColumn="0" w:lastRow="0" w:noHBand="0" w:noVBand="1" w:val="04A0"/>
-      </w:tblPr>
-      <w:tblGrid>
-        <w:gridCol w:w="7483"/>
-      </w:tblGrid>
-      <w:tr>
-        <w:tc>
-          <w:tcPr>
-            <w:tcW w:type="dxa" w:w="7483"/>
-            <w:shd w:fill="EDF5EA"/>
-            <w:tcMar>
-              <w:top w:w="45" w:type="dxa"/>
-              <w:start w:w="70" w:type="dxa"/>
-              <w:bottom w:w="45" w:type="dxa"/>
-              <w:end w:w="70" w:type="dxa"/>
-            </w:tcMar>
-          </w:tcPr>
-          <w:p>
-            <w:pPr>
-              <w:spacing w:after="0"/>
-            </w:pPr>
-            <w:r>
-              <w:rPr>
-                <w:b/>
-                <w:color w:val="4D8B3F"/>
-              </w:rPr>
-              <w:t>Reflexion</w:t>
-            </w:r>
-            <w:r>
-              <w:rPr>
-                <w:sz w:val="17"/>
-              </w:rPr>
-              <w:br/>
-              <w:t>• Hast du die Zahlen genau übernommen?</w:t>
-            </w:r>
-            <w:r>
-              <w:rPr>
-                <w:sz w:val="17"/>
-              </w:rPr>
-              <w:br/>
-              <w:t>• Ist klar, was die Daten zeigen?</w:t>
-            </w:r>
-            <w:r>
-              <w:rPr>
-                <w:sz w:val="17"/>
-              </w:rPr>
-              <w:br/>
-              <w:t>• Verstärken die Daten deinen Wunsch?</w:t>
-            </w:r>
-          </w:p>
-        </w:tc>
-      </w:tr>
-    </w:tbl>
-    <w:p>
-      <w:pPr>
-        <w:spacing w:after="0"/>
-      </w:pPr>
     </w:p>
     <w:p>
       <w:pPr>
         <w:pStyle w:val="Heading2"/>
       </w:pPr>
       <w:r>
-        <w:t>Das soll dein Ergebnis können</w:t>
+        <w:t>Durchführung</w:t>
       </w:r>
     </w:p>
     <w:p>
-      <w:pPr>
-        <w:spacing w:after="20" w:line="240" w:lineRule="auto"/>
-      </w:pPr>
       <w:r>
-        <w:rPr>
-          <w:b/>
-        </w:rPr>
-        <w:t xml:space="preserve">• </w:t>
+        <w:t>Schreibe einen vollständigen Brief. Erkläre deinen wichtigsten Grund. Ergänze eine konkrete Bitte: Was soll die Person als Nächstes tun?</w:t>
       </w:r>
-      <w:r>
-        <w:rPr>
-          <w:sz w:val="17"/>
-        </w:rPr>
-        <w:t>Zahlen stimmen</w:t>
-      </w:r>
-    </w:p>
-    <w:p>
-      <w:pPr>
-        <w:spacing w:after="20" w:line="240" w:lineRule="auto"/>
-      </w:pPr>
-      <w:r>
-        <w:rPr>
-          <w:b/>
-        </w:rPr>
-        <w:t xml:space="preserve">• </w:t>
-      </w:r>
-      <w:r>
-        <w:rPr>
-          <w:sz w:val="17"/>
-        </w:rPr>
-        <w:t>Daten werden verständlich erklärt</w:t>
-      </w:r>
-    </w:p>
-    <w:p>
-      <w:pPr>
-        <w:spacing w:after="20" w:line="240" w:lineRule="auto"/>
-      </w:pPr>
-      <w:r>
-        <w:rPr>
-          <w:b/>
-        </w:rPr>
-        <w:t xml:space="preserve">• </w:t>
-      </w:r>
-      <w:r>
-        <w:rPr>
-          <w:sz w:val="17"/>
-        </w:rPr>
-        <w:t>Wunsch und Ergebnis passen zusammen</w:t>
-      </w:r>
-    </w:p>
-    <w:p>
-      <w:pPr>
-        <w:spacing w:after="20" w:line="240" w:lineRule="auto"/>
-      </w:pPr>
-      <w:r>
-        <w:rPr>
-          <w:b/>
-        </w:rPr>
-        <w:t xml:space="preserve">• </w:t>
-      </w:r>
-      <w:r>
-        <w:rPr>
-          <w:sz w:val="17"/>
-        </w:rPr>
-        <w:t>keine übertriebenen Aussagen wie „alle“</w:t>
-      </w:r>
-    </w:p>
-    <w:tbl>
-      <w:tblPr>
-        <w:tblW w:type="auto" w:w="0"/>
-        <w:jc w:val="center"/>
-        <w:tblLook w:firstColumn="1" w:firstRow="1" w:lastColumn="0" w:lastRow="0" w:noHBand="0" w:noVBand="1" w:val="04A0"/>
-      </w:tblPr>
-      <w:tblGrid>
-        <w:gridCol w:w="7483"/>
-      </w:tblGrid>
-      <w:tr>
-        <w:tc>
-          <w:tcPr>
-            <w:tcW w:type="dxa" w:w="7483"/>
-            <w:shd w:fill="EEF2F4"/>
-            <w:tcMar>
-              <w:top w:w="80" w:type="dxa"/>
-              <w:start w:w="100" w:type="dxa"/>
-              <w:bottom w:w="80" w:type="dxa"/>
-              <w:end w:w="100" w:type="dxa"/>
-            </w:tcMar>
-          </w:tcPr>
-          <w:p>
-            <w:pPr>
-              <w:spacing w:after="0"/>
-            </w:pPr>
-            <w:r>
-              <w:rPr>
-                <w:b/>
-                <w:color w:val="3E5668"/>
-                <w:sz w:val="19"/>
-              </w:rPr>
-              <w:t>Du kannst nutzen</w:t>
-            </w:r>
-            <w:r>
-              <w:br/>
-              <w:t>echte Klassendaten, Diagramme aus Mathematik, Merkblatt „Wunsch begründen“</w:t>
-            </w:r>
-          </w:p>
-        </w:tc>
-      </w:tr>
-    </w:tbl>
-    <w:p>
-      <w:pPr>
-        <w:spacing w:after="20"/>
-      </w:pPr>
-    </w:p>
-    <w:p>
-      <w:r>
-        <w:br w:type="page"/>
-      </w:r>
-    </w:p>
-    <w:p>
-      <w:pPr>
-        <w:spacing w:after="20"/>
-        <w:jc w:val="center"/>
-      </w:pPr>
-      <w:r>
-        <w:rPr>
-          <w:b/>
-          <w:color w:val="3E5668"/>
-          <w:sz w:val="29"/>
-        </w:rPr>
-        <w:t>Projekt 3 – Verbesserungsidee für einen Schulort</w:t>
-      </w:r>
-    </w:p>
-    <w:p>
-      <w:pPr>
-        <w:spacing w:after="80"/>
-        <w:jc w:val="center"/>
-      </w:pPr>
-      <w:r>
-        <w:rPr>
-          <w:i/>
-          <w:color w:val="D97A4A"/>
-          <w:sz w:val="17"/>
-        </w:rPr>
-        <w:t>Freiwilliges Projekt</w:t>
-      </w:r>
-    </w:p>
-    <w:tbl>
-      <w:tblPr>
-        <w:tblW w:type="auto" w:w="0"/>
-        <w:jc w:val="center"/>
-        <w:tblLook w:firstColumn="1" w:firstRow="1" w:lastColumn="0" w:lastRow="0" w:noHBand="0" w:noVBand="1" w:val="04A0"/>
-      </w:tblPr>
-      <w:tblGrid>
-        <w:gridCol w:w="7483"/>
-      </w:tblGrid>
-      <w:tr>
-        <w:tc>
-          <w:tcPr>
-            <w:tcW w:type="dxa" w:w="7483"/>
-            <w:shd w:fill="FBF5E2"/>
-            <w:tcMar>
-              <w:top w:w="80" w:type="dxa"/>
-              <w:start w:w="100" w:type="dxa"/>
-              <w:bottom w:w="80" w:type="dxa"/>
-              <w:end w:w="100" w:type="dxa"/>
-            </w:tcMar>
-          </w:tcPr>
-          <w:p>
-            <w:pPr>
-              <w:spacing w:after="0"/>
-            </w:pPr>
-            <w:r>
-              <w:rPr>
-                <w:b/>
-                <w:color w:val="C17B00"/>
-                <w:sz w:val="19"/>
-              </w:rPr>
-              <w:t>Dein Produkt</w:t>
-            </w:r>
-            <w:r>
-              <w:br/>
-              <w:t>Du entwickelst eine konkrete Verbesserung für einen Ort an der Schule und stellst sie auf einer Projektseite vor.</w:t>
-            </w:r>
-          </w:p>
-        </w:tc>
-      </w:tr>
-    </w:tbl>
-    <w:p>
-      <w:pPr>
-        <w:spacing w:after="20"/>
-      </w:pPr>
-    </w:p>
-    <w:tbl>
-      <w:tblPr>
-        <w:tblW w:type="auto" w:w="0"/>
-        <w:jc w:val="center"/>
-        <w:tblLook w:firstColumn="1" w:firstRow="1" w:lastColumn="0" w:lastRow="0" w:noHBand="0" w:noVBand="1" w:val="04A0"/>
-      </w:tblPr>
-      <w:tblGrid>
-        <w:gridCol w:w="7483"/>
-      </w:tblGrid>
-      <w:tr>
-        <w:tc>
-          <w:tcPr>
-            <w:tcW w:type="dxa" w:w="7483"/>
-            <w:shd w:fill="EEF2F4"/>
-            <w:tcMar>
-              <w:top w:w="45" w:type="dxa"/>
-              <w:start w:w="70" w:type="dxa"/>
-              <w:bottom w:w="45" w:type="dxa"/>
-              <w:end w:w="70" w:type="dxa"/>
-            </w:tcMar>
-          </w:tcPr>
-          <w:p>
-            <w:pPr>
-              <w:spacing w:after="0"/>
-            </w:pPr>
-            <w:r>
-              <w:rPr>
-                <w:b/>
-                <w:color w:val="3E5668"/>
-              </w:rPr>
-              <w:t>Planung</w:t>
-            </w:r>
-            <w:r>
-              <w:rPr>
-                <w:sz w:val="17"/>
-              </w:rPr>
-              <w:br/>
-              <w:t>• Wähle einen Ort: Klassenraum, Schulhof, Flur, Mensa oder Pausenbereich.</w:t>
-            </w:r>
-            <w:r>
-              <w:rPr>
-                <w:sz w:val="17"/>
-              </w:rPr>
-              <w:br/>
-              <w:t>• Beschreibe das Problem.</w:t>
-            </w:r>
-            <w:r>
-              <w:rPr>
-                <w:sz w:val="17"/>
-              </w:rPr>
-              <w:br/>
-              <w:t>• Sammle eine realistische Lösung.</w:t>
-            </w:r>
-          </w:p>
-        </w:tc>
-      </w:tr>
-    </w:tbl>
-    <w:p>
-      <w:pPr>
-        <w:spacing w:after="0"/>
-      </w:pPr>
-    </w:p>
-    <w:tbl>
-      <w:tblPr>
-        <w:tblW w:type="auto" w:w="0"/>
-        <w:jc w:val="center"/>
-        <w:tblLook w:firstColumn="1" w:firstRow="1" w:lastColumn="0" w:lastRow="0" w:noHBand="0" w:noVBand="1" w:val="04A0"/>
-      </w:tblPr>
-      <w:tblGrid>
-        <w:gridCol w:w="7483"/>
-      </w:tblGrid>
-      <w:tr>
-        <w:tc>
-          <w:tcPr>
-            <w:tcW w:type="dxa" w:w="7483"/>
-            <w:shd w:fill="F8EEE7"/>
-            <w:tcMar>
-              <w:top w:w="45" w:type="dxa"/>
-              <w:start w:w="70" w:type="dxa"/>
-              <w:bottom w:w="45" w:type="dxa"/>
-              <w:end w:w="70" w:type="dxa"/>
-            </w:tcMar>
-          </w:tcPr>
-          <w:p>
-            <w:pPr>
-              <w:spacing w:after="0"/>
-            </w:pPr>
-            <w:r>
-              <w:rPr>
-                <w:b/>
-                <w:color w:val="D97A4A"/>
-              </w:rPr>
-              <w:t>Durchführung</w:t>
-            </w:r>
-            <w:r>
-              <w:rPr>
-                <w:sz w:val="17"/>
-              </w:rPr>
-              <w:br/>
-              <w:t>• Zeichne oder beschreibe deine Idee.</w:t>
-            </w:r>
-            <w:r>
-              <w:rPr>
-                <w:sz w:val="17"/>
-              </w:rPr>
-              <w:br/>
-              <w:t>• Formuliere einen kurzen Wunschbrief.</w:t>
-            </w:r>
-            <w:r>
-              <w:rPr>
-                <w:sz w:val="17"/>
-              </w:rPr>
-              <w:br/>
-              <w:t>• Ergänze Vorteile und mögliche Schwierigkeiten.</w:t>
-            </w:r>
-            <w:r>
-              <w:rPr>
-                <w:sz w:val="17"/>
-              </w:rPr>
-              <w:br/>
-              <w:t>• Finde eine Lösung für mindestens ein Bedenken.</w:t>
-            </w:r>
-          </w:p>
-        </w:tc>
-      </w:tr>
-    </w:tbl>
-    <w:p>
-      <w:pPr>
-        <w:spacing w:after="0"/>
-      </w:pPr>
-    </w:p>
-    <w:tbl>
-      <w:tblPr>
-        <w:tblW w:type="auto" w:w="0"/>
-        <w:jc w:val="center"/>
-        <w:tblLook w:firstColumn="1" w:firstRow="1" w:lastColumn="0" w:lastRow="0" w:noHBand="0" w:noVBand="1" w:val="04A0"/>
-      </w:tblPr>
-      <w:tblGrid>
-        <w:gridCol w:w="7483"/>
-      </w:tblGrid>
-      <w:tr>
-        <w:tc>
-          <w:tcPr>
-            <w:tcW w:type="dxa" w:w="7483"/>
-            <w:shd w:fill="EDF5EA"/>
-            <w:tcMar>
-              <w:top w:w="45" w:type="dxa"/>
-              <w:start w:w="70" w:type="dxa"/>
-              <w:bottom w:w="45" w:type="dxa"/>
-              <w:end w:w="70" w:type="dxa"/>
-            </w:tcMar>
-          </w:tcPr>
-          <w:p>
-            <w:pPr>
-              <w:spacing w:after="0"/>
-            </w:pPr>
-            <w:r>
-              <w:rPr>
-                <w:b/>
-                <w:color w:val="4D8B3F"/>
-              </w:rPr>
-              <w:t>Reflexion</w:t>
-            </w:r>
-            <w:r>
-              <w:rPr>
-                <w:sz w:val="17"/>
-              </w:rPr>
-              <w:br/>
-              <w:t>• Ist die Idee realistisch?</w:t>
-            </w:r>
-            <w:r>
-              <w:rPr>
-                <w:sz w:val="17"/>
-              </w:rPr>
-              <w:br/>
-              <w:t>• Wer würde davon profitieren?</w:t>
-            </w:r>
-            <w:r>
-              <w:rPr>
-                <w:sz w:val="17"/>
-              </w:rPr>
-              <w:br/>
-              <w:t>• Was müsste als Nächstes passieren?</w:t>
-            </w:r>
-          </w:p>
-        </w:tc>
-      </w:tr>
-    </w:tbl>
-    <w:p>
-      <w:pPr>
-        <w:spacing w:after="0"/>
-      </w:pPr>
     </w:p>
     <w:p>
       <w:pPr>
         <w:pStyle w:val="Heading2"/>
       </w:pPr>
       <w:r>
-        <w:t>Das soll dein Ergebnis können</w:t>
+        <w:t>Reflexion</w:t>
+      </w:r>
+    </w:p>
+    <w:p>
+      <w:r>
+        <w:t>Zeige deinen stärksten Grund. Erkläre mündlich, warum du ihn gewählt hast. Prüfe den Brief mit Merkblatt 6.</w:t>
       </w:r>
     </w:p>
     <w:p>
       <w:pPr>
-        <w:spacing w:after="20" w:line="240" w:lineRule="auto"/>
+        <w:shd w:fill="EEF2F4"/>
       </w:pPr>
       <w:r>
         <w:rPr>
           <w:b/>
         </w:rPr>
-        <w:t xml:space="preserve">• </w:t>
+        <w:t>Prüfe</w:t>
+        <w:br/>
       </w:r>
       <w:r>
-        <w:rPr>
-          <w:sz w:val="17"/>
-        </w:rPr>
-        <w:t>Ort und Problem klar beschrieben</w:t>
+        <w:t>Dein Wunsch ist klar. Dein Grund passt zur Person. Deine Bitte nennt einen machbaren nächsten Schritt.</w:t>
+      </w:r>
+    </w:p>
+    <w:p>
+      <w:r>
+        <w:t>Hilfe: Gib den Brief nur nach Absprache mit der Lehrkraft ab. Ein Übungsbrief ist auch möglich.</w:t>
       </w:r>
     </w:p>
     <w:p>
       <w:pPr>
-        <w:spacing w:after="20" w:line="240" w:lineRule="auto"/>
+        <w:pStyle w:val="Title"/>
+        <w:pageBreakBefore/>
+      </w:pPr>
+      <w:r>
+        <w:t>Projekt 2 · freiwillig</w:t>
+      </w:r>
+    </w:p>
+    <w:p>
+      <w:pPr>
+        <w:pStyle w:val="Heading1"/>
+      </w:pPr>
+      <w:r>
+        <w:t>Eine Umfrage prüfen und nutzen</w:t>
+      </w:r>
+    </w:p>
+    <w:p>
+      <w:pPr>
+        <w:shd w:fill="EEF2F4"/>
       </w:pPr>
       <w:r>
         <w:rPr>
           <w:b/>
         </w:rPr>
-        <w:t xml:space="preserve">• </w:t>
+        <w:t>Dein Ergebnis</w:t>
+        <w:br/>
       </w:r>
       <w:r>
-        <w:rPr>
-          <w:sz w:val="17"/>
-        </w:rPr>
-        <w:t>Lösung verständlich dargestellt</w:t>
+        <w:t>Zwei Sätze zu Zahlen und ein kurzer Wunschbrief.</w:t>
       </w:r>
     </w:p>
     <w:p>
-      <w:pPr>
-        <w:spacing w:after="20" w:line="240" w:lineRule="auto"/>
-      </w:pPr>
       <w:r>
-        <w:rPr>
-          <w:b/>
-        </w:rPr>
-        <w:t xml:space="preserve">• </w:t>
+        <w:t>Material: Heft, Datenkarte, Merkblatt 4.</w:t>
       </w:r>
-      <w:r>
-        <w:rPr>
-          <w:sz w:val="17"/>
-        </w:rPr>
-        <w:t>freundlicher Wunschbrief</w:t>
-      </w:r>
-    </w:p>
-    <w:p>
-      <w:pPr>
-        <w:spacing w:after="20" w:line="240" w:lineRule="auto"/>
-      </w:pPr>
-      <w:r>
-        <w:rPr>
-          <w:b/>
-        </w:rPr>
-        <w:t xml:space="preserve">• </w:t>
-      </w:r>
-      <w:r>
-        <w:rPr>
-          <w:sz w:val="17"/>
-        </w:rPr>
-        <w:t>ein Bedenken mit Lösung</w:t>
-      </w:r>
-    </w:p>
-    <w:p>
-      <w:pPr>
-        <w:spacing w:after="20" w:line="240" w:lineRule="auto"/>
-      </w:pPr>
-      <w:r>
-        <w:rPr>
-          <w:b/>
-        </w:rPr>
-        <w:t xml:space="preserve">• </w:t>
-      </w:r>
-      <w:r>
-        <w:rPr>
-          <w:sz w:val="17"/>
-        </w:rPr>
-        <w:t>übersichtliche Gestaltung</w:t>
-      </w:r>
-    </w:p>
-    <w:tbl>
-      <w:tblPr>
-        <w:tblW w:type="auto" w:w="0"/>
-        <w:jc w:val="center"/>
-        <w:tblLook w:firstColumn="1" w:firstRow="1" w:lastColumn="0" w:lastRow="0" w:noHBand="0" w:noVBand="1" w:val="04A0"/>
-      </w:tblPr>
-      <w:tblGrid>
-        <w:gridCol w:w="7483"/>
-      </w:tblGrid>
-      <w:tr>
-        <w:tc>
-          <w:tcPr>
-            <w:tcW w:type="dxa" w:w="7483"/>
-            <w:shd w:fill="EEF2F4"/>
-            <w:tcMar>
-              <w:top w:w="80" w:type="dxa"/>
-              <w:start w:w="100" w:type="dxa"/>
-              <w:bottom w:w="80" w:type="dxa"/>
-              <w:end w:w="100" w:type="dxa"/>
-            </w:tcMar>
-          </w:tcPr>
-          <w:p>
-            <w:pPr>
-              <w:spacing w:after="0"/>
-            </w:pPr>
-            <w:r>
-              <w:rPr>
-                <w:b/>
-                <w:color w:val="3E5668"/>
-                <w:sz w:val="19"/>
-              </w:rPr>
-              <w:t>Du kannst nutzen</w:t>
-            </w:r>
-            <w:r>
-              <w:br/>
-              <w:t>Papier oder Laptop, Skizzen, Fotos ohne Personen, Umfrageergebnisse</w:t>
-            </w:r>
-          </w:p>
-        </w:tc>
-      </w:tr>
-    </w:tbl>
-    <w:p>
-      <w:pPr>
-        <w:spacing w:after="20"/>
-      </w:pPr>
-    </w:p>
-    <w:p>
-      <w:r>
-        <w:br w:type="page"/>
-      </w:r>
-    </w:p>
-    <w:p>
-      <w:pPr>
-        <w:spacing w:after="20"/>
-        <w:jc w:val="center"/>
-      </w:pPr>
-      <w:r>
-        <w:rPr>
-          <w:b/>
-          <w:color w:val="3E5668"/>
-          <w:sz w:val="29"/>
-        </w:rPr>
-        <w:t>Projekt 4 – Ausstellungsposter: Das wünschen wir uns</w:t>
-      </w:r>
-    </w:p>
-    <w:p>
-      <w:pPr>
-        <w:spacing w:after="80"/>
-        <w:jc w:val="center"/>
-      </w:pPr>
-      <w:r>
-        <w:rPr>
-          <w:i/>
-          <w:color w:val="D97A4A"/>
-          <w:sz w:val="17"/>
-        </w:rPr>
-        <w:t>Freiwilliges Projekt</w:t>
-      </w:r>
-    </w:p>
-    <w:tbl>
-      <w:tblPr>
-        <w:tblW w:type="auto" w:w="0"/>
-        <w:jc w:val="center"/>
-        <w:tblLook w:firstColumn="1" w:firstRow="1" w:lastColumn="0" w:lastRow="0" w:noHBand="0" w:noVBand="1" w:val="04A0"/>
-      </w:tblPr>
-      <w:tblGrid>
-        <w:gridCol w:w="7483"/>
-      </w:tblGrid>
-      <w:tr>
-        <w:tc>
-          <w:tcPr>
-            <w:tcW w:type="dxa" w:w="7483"/>
-            <w:shd w:fill="FBF5E2"/>
-            <w:tcMar>
-              <w:top w:w="80" w:type="dxa"/>
-              <w:start w:w="100" w:type="dxa"/>
-              <w:bottom w:w="80" w:type="dxa"/>
-              <w:end w:w="100" w:type="dxa"/>
-            </w:tcMar>
-          </w:tcPr>
-          <w:p>
-            <w:pPr>
-              <w:spacing w:after="0"/>
-            </w:pPr>
-            <w:r>
-              <w:rPr>
-                <w:b/>
-                <w:color w:val="C17B00"/>
-                <w:sz w:val="19"/>
-              </w:rPr>
-              <w:t>Dein Produkt</w:t>
-            </w:r>
-            <w:r>
-              <w:br/>
-              <w:t>Du gestaltest ein Poster, das einen Wunsch, ein Umfrageergebnis und einen kurzen Briefauszug verbindet.</w:t>
-            </w:r>
-          </w:p>
-        </w:tc>
-      </w:tr>
-    </w:tbl>
-    <w:p>
-      <w:pPr>
-        <w:spacing w:after="20"/>
-      </w:pPr>
-    </w:p>
-    <w:tbl>
-      <w:tblPr>
-        <w:tblW w:type="auto" w:w="0"/>
-        <w:jc w:val="center"/>
-        <w:tblLook w:firstColumn="1" w:firstRow="1" w:lastColumn="0" w:lastRow="0" w:noHBand="0" w:noVBand="1" w:val="04A0"/>
-      </w:tblPr>
-      <w:tblGrid>
-        <w:gridCol w:w="7483"/>
-      </w:tblGrid>
-      <w:tr>
-        <w:tc>
-          <w:tcPr>
-            <w:tcW w:type="dxa" w:w="7483"/>
-            <w:shd w:fill="EEF2F4"/>
-            <w:tcMar>
-              <w:top w:w="45" w:type="dxa"/>
-              <w:start w:w="70" w:type="dxa"/>
-              <w:bottom w:w="45" w:type="dxa"/>
-              <w:end w:w="70" w:type="dxa"/>
-            </w:tcMar>
-          </w:tcPr>
-          <w:p>
-            <w:pPr>
-              <w:spacing w:after="0"/>
-            </w:pPr>
-            <w:r>
-              <w:rPr>
-                <w:b/>
-                <w:color w:val="3E5668"/>
-              </w:rPr>
-              <w:t>Planung</w:t>
-            </w:r>
-            <w:r>
-              <w:rPr>
-                <w:sz w:val="17"/>
-              </w:rPr>
-              <w:br/>
-              <w:t>• Wähle einen Wunsch und passende Daten.</w:t>
-            </w:r>
-            <w:r>
-              <w:rPr>
-                <w:sz w:val="17"/>
-              </w:rPr>
-              <w:br/>
-              <w:t>• Plane die Aufteilung des Posters.</w:t>
-            </w:r>
-            <w:r>
-              <w:rPr>
-                <w:sz w:val="17"/>
-              </w:rPr>
-              <w:br/>
-              <w:t>• Entscheide, welcher Briefausschnitt gezeigt wird.</w:t>
-            </w:r>
-          </w:p>
-        </w:tc>
-      </w:tr>
-    </w:tbl>
-    <w:p>
-      <w:pPr>
-        <w:spacing w:after="0"/>
-      </w:pPr>
-    </w:p>
-    <w:tbl>
-      <w:tblPr>
-        <w:tblW w:type="auto" w:w="0"/>
-        <w:jc w:val="center"/>
-        <w:tblLook w:firstColumn="1" w:firstRow="1" w:lastColumn="0" w:lastRow="0" w:noHBand="0" w:noVBand="1" w:val="04A0"/>
-      </w:tblPr>
-      <w:tblGrid>
-        <w:gridCol w:w="7483"/>
-      </w:tblGrid>
-      <w:tr>
-        <w:tc>
-          <w:tcPr>
-            <w:tcW w:type="dxa" w:w="7483"/>
-            <w:shd w:fill="F8EEE7"/>
-            <w:tcMar>
-              <w:top w:w="45" w:type="dxa"/>
-              <w:start w:w="70" w:type="dxa"/>
-              <w:bottom w:w="45" w:type="dxa"/>
-              <w:end w:w="70" w:type="dxa"/>
-            </w:tcMar>
-          </w:tcPr>
-          <w:p>
-            <w:pPr>
-              <w:spacing w:after="0"/>
-            </w:pPr>
-            <w:r>
-              <w:rPr>
-                <w:b/>
-                <w:color w:val="D97A4A"/>
-              </w:rPr>
-              <w:t>Durchführung</w:t>
-            </w:r>
-            <w:r>
-              <w:rPr>
-                <w:sz w:val="17"/>
-              </w:rPr>
-              <w:br/>
-              <w:t>• Erstelle eine klare Überschrift.</w:t>
-            </w:r>
-            <w:r>
-              <w:rPr>
-                <w:sz w:val="17"/>
-              </w:rPr>
-              <w:br/>
-              <w:t>• Zeige das Umfrageergebnis als Diagramm oder Zahl.</w:t>
-            </w:r>
-            <w:r>
-              <w:rPr>
-                <w:sz w:val="17"/>
-              </w:rPr>
-              <w:br/>
-              <w:t>• Schreibe einen kurzen erklärenden Text.</w:t>
-            </w:r>
-            <w:r>
-              <w:rPr>
-                <w:sz w:val="17"/>
-              </w:rPr>
-              <w:br/>
-              <w:t>• Füge einen passenden Briefauszug hinzu.</w:t>
-            </w:r>
-          </w:p>
-        </w:tc>
-      </w:tr>
-    </w:tbl>
-    <w:p>
-      <w:pPr>
-        <w:spacing w:after="0"/>
-      </w:pPr>
-    </w:p>
-    <w:tbl>
-      <w:tblPr>
-        <w:tblW w:type="auto" w:w="0"/>
-        <w:jc w:val="center"/>
-        <w:tblLook w:firstColumn="1" w:firstRow="1" w:lastColumn="0" w:lastRow="0" w:noHBand="0" w:noVBand="1" w:val="04A0"/>
-      </w:tblPr>
-      <w:tblGrid>
-        <w:gridCol w:w="7483"/>
-      </w:tblGrid>
-      <w:tr>
-        <w:tc>
-          <w:tcPr>
-            <w:tcW w:type="dxa" w:w="7483"/>
-            <w:shd w:fill="EDF5EA"/>
-            <w:tcMar>
-              <w:top w:w="45" w:type="dxa"/>
-              <w:start w:w="70" w:type="dxa"/>
-              <w:bottom w:w="45" w:type="dxa"/>
-              <w:end w:w="70" w:type="dxa"/>
-            </w:tcMar>
-          </w:tcPr>
-          <w:p>
-            <w:pPr>
-              <w:spacing w:after="0"/>
-            </w:pPr>
-            <w:r>
-              <w:rPr>
-                <w:b/>
-                <w:color w:val="4D8B3F"/>
-              </w:rPr>
-              <w:t>Reflexion</w:t>
-            </w:r>
-            <w:r>
-              <w:rPr>
-                <w:sz w:val="17"/>
-              </w:rPr>
-              <w:br/>
-              <w:t>• Kann man das Poster schnell verstehen?</w:t>
-            </w:r>
-            <w:r>
-              <w:rPr>
-                <w:sz w:val="17"/>
-              </w:rPr>
-              <w:br/>
-              <w:t>• Sind Wunsch und Daten klar verbunden?</w:t>
-            </w:r>
-            <w:r>
-              <w:rPr>
-                <w:sz w:val="17"/>
-              </w:rPr>
-              <w:br/>
-              <w:t>• Ist die Schrift gut lesbar?</w:t>
-            </w:r>
-          </w:p>
-        </w:tc>
-      </w:tr>
-    </w:tbl>
-    <w:p>
-      <w:pPr>
-        <w:spacing w:after="0"/>
-      </w:pPr>
     </w:p>
     <w:p>
       <w:pPr>
         <w:pStyle w:val="Heading2"/>
       </w:pPr>
       <w:r>
-        <w:t>Das soll dein Ergebnis können</w:t>
+        <w:t>Planung</w:t>
       </w:r>
     </w:p>
     <w:p>
-      <w:pPr>
-        <w:spacing w:after="20" w:line="240" w:lineRule="auto"/>
-      </w:pPr>
       <w:r>
-        <w:rPr>
-          <w:b/>
-        </w:rPr>
-        <w:t xml:space="preserve">• </w:t>
+        <w:t>Lies die Datenkarte. Wähle einen der vier Wünsche. Prüfe: Wer wurde befragt? Wie oft durfte jedes Kind wählen?</w:t>
       </w:r>
-      <w:r>
-        <w:rPr>
-          <w:sz w:val="17"/>
-        </w:rPr>
-        <w:t>klare Überschrift</w:t>
-      </w:r>
-    </w:p>
-    <w:p>
-      <w:pPr>
-        <w:spacing w:after="20" w:line="240" w:lineRule="auto"/>
-      </w:pPr>
-      <w:r>
-        <w:rPr>
-          <w:b/>
-        </w:rPr>
-        <w:t xml:space="preserve">• </w:t>
-      </w:r>
-      <w:r>
-        <w:rPr>
-          <w:sz w:val="17"/>
-        </w:rPr>
-        <w:t>korrektes Umfrageergebnis</w:t>
-      </w:r>
-    </w:p>
-    <w:p>
-      <w:pPr>
-        <w:spacing w:after="20" w:line="240" w:lineRule="auto"/>
-      </w:pPr>
-      <w:r>
-        <w:rPr>
-          <w:b/>
-        </w:rPr>
-        <w:t xml:space="preserve">• </w:t>
-      </w:r>
-      <w:r>
-        <w:rPr>
-          <w:sz w:val="17"/>
-        </w:rPr>
-        <w:t>verständliche Erklärung</w:t>
-      </w:r>
-    </w:p>
-    <w:p>
-      <w:pPr>
-        <w:spacing w:after="20" w:line="240" w:lineRule="auto"/>
-      </w:pPr>
-      <w:r>
-        <w:rPr>
-          <w:b/>
-        </w:rPr>
-        <w:t xml:space="preserve">• </w:t>
-      </w:r>
-      <w:r>
-        <w:rPr>
-          <w:sz w:val="17"/>
-        </w:rPr>
-        <w:t>passender Briefauszug</w:t>
-      </w:r>
-    </w:p>
-    <w:p>
-      <w:pPr>
-        <w:spacing w:after="20" w:line="240" w:lineRule="auto"/>
-      </w:pPr>
-      <w:r>
-        <w:rPr>
-          <w:b/>
-        </w:rPr>
-        <w:t xml:space="preserve">• </w:t>
-      </w:r>
-      <w:r>
-        <w:rPr>
-          <w:sz w:val="17"/>
-        </w:rPr>
-        <w:t>übersichtliche Gestaltung</w:t>
-      </w:r>
-    </w:p>
-    <w:tbl>
-      <w:tblPr>
-        <w:tblW w:type="auto" w:w="0"/>
-        <w:jc w:val="center"/>
-        <w:tblLook w:firstColumn="1" w:firstRow="1" w:lastColumn="0" w:lastRow="0" w:noHBand="0" w:noVBand="1" w:val="04A0"/>
-      </w:tblPr>
-      <w:tblGrid>
-        <w:gridCol w:w="7483"/>
-      </w:tblGrid>
-      <w:tr>
-        <w:tc>
-          <w:tcPr>
-            <w:tcW w:type="dxa" w:w="7483"/>
-            <w:shd w:fill="EEF2F4"/>
-            <w:tcMar>
-              <w:top w:w="80" w:type="dxa"/>
-              <w:start w:w="100" w:type="dxa"/>
-              <w:bottom w:w="80" w:type="dxa"/>
-              <w:end w:w="100" w:type="dxa"/>
-            </w:tcMar>
-          </w:tcPr>
-          <w:p>
-            <w:pPr>
-              <w:spacing w:after="0"/>
-            </w:pPr>
-            <w:r>
-              <w:rPr>
-                <w:b/>
-                <w:color w:val="3E5668"/>
-                <w:sz w:val="19"/>
-              </w:rPr>
-              <w:t>Du kannst nutzen</w:t>
-            </w:r>
-            <w:r>
-              <w:br/>
-              <w:t>Plakatpapier oder Präsentationsprogramm am Laptop</w:t>
-            </w:r>
-          </w:p>
-        </w:tc>
-      </w:tr>
-    </w:tbl>
-    <w:p>
-      <w:pPr>
-        <w:spacing w:after="20"/>
-      </w:pPr>
-    </w:p>
-    <w:p>
-      <w:r>
-        <w:br w:type="page"/>
-      </w:r>
-    </w:p>
-    <w:p>
-      <w:pPr>
-        <w:spacing w:after="20"/>
-        <w:jc w:val="center"/>
-      </w:pPr>
-      <w:r>
-        <w:rPr>
-          <w:b/>
-          <w:color w:val="3E5668"/>
-          <w:sz w:val="29"/>
-        </w:rPr>
-        <w:t>Projekt 5 – Zwei Briefe, zwei Empfänger</w:t>
-      </w:r>
-    </w:p>
-    <w:p>
-      <w:pPr>
-        <w:spacing w:after="80"/>
-        <w:jc w:val="center"/>
-      </w:pPr>
-      <w:r>
-        <w:rPr>
-          <w:i/>
-          <w:color w:val="D97A4A"/>
-          <w:sz w:val="17"/>
-        </w:rPr>
-        <w:t>Freiwilliges Projekt</w:t>
-      </w:r>
-    </w:p>
-    <w:tbl>
-      <w:tblPr>
-        <w:tblW w:type="auto" w:w="0"/>
-        <w:jc w:val="center"/>
-        <w:tblLook w:firstColumn="1" w:firstRow="1" w:lastColumn="0" w:lastRow="0" w:noHBand="0" w:noVBand="1" w:val="04A0"/>
-      </w:tblPr>
-      <w:tblGrid>
-        <w:gridCol w:w="7483"/>
-      </w:tblGrid>
-      <w:tr>
-        <w:tc>
-          <w:tcPr>
-            <w:tcW w:type="dxa" w:w="7483"/>
-            <w:shd w:fill="FBF5E2"/>
-            <w:tcMar>
-              <w:top w:w="80" w:type="dxa"/>
-              <w:start w:w="100" w:type="dxa"/>
-              <w:bottom w:w="80" w:type="dxa"/>
-              <w:end w:w="100" w:type="dxa"/>
-            </w:tcMar>
-          </w:tcPr>
-          <w:p>
-            <w:pPr>
-              <w:spacing w:after="0"/>
-            </w:pPr>
-            <w:r>
-              <w:rPr>
-                <w:b/>
-                <w:color w:val="C17B00"/>
-                <w:sz w:val="19"/>
-              </w:rPr>
-              <w:t>Dein Produkt</w:t>
-            </w:r>
-            <w:r>
-              <w:br/>
-              <w:t>Du schreibst denselben Wunsch an zwei unterschiedliche Empfänger und vergleichst deine Formulierungen.</w:t>
-            </w:r>
-          </w:p>
-        </w:tc>
-      </w:tr>
-    </w:tbl>
-    <w:p>
-      <w:pPr>
-        <w:spacing w:after="20"/>
-      </w:pPr>
-    </w:p>
-    <w:tbl>
-      <w:tblPr>
-        <w:tblW w:type="auto" w:w="0"/>
-        <w:jc w:val="center"/>
-        <w:tblLook w:firstColumn="1" w:firstRow="1" w:lastColumn="0" w:lastRow="0" w:noHBand="0" w:noVBand="1" w:val="04A0"/>
-      </w:tblPr>
-      <w:tblGrid>
-        <w:gridCol w:w="7483"/>
-      </w:tblGrid>
-      <w:tr>
-        <w:tc>
-          <w:tcPr>
-            <w:tcW w:type="dxa" w:w="7483"/>
-            <w:shd w:fill="EEF2F4"/>
-            <w:tcMar>
-              <w:top w:w="45" w:type="dxa"/>
-              <w:start w:w="70" w:type="dxa"/>
-              <w:bottom w:w="45" w:type="dxa"/>
-              <w:end w:w="70" w:type="dxa"/>
-            </w:tcMar>
-          </w:tcPr>
-          <w:p>
-            <w:pPr>
-              <w:spacing w:after="0"/>
-            </w:pPr>
-            <w:r>
-              <w:rPr>
-                <w:b/>
-                <w:color w:val="3E5668"/>
-              </w:rPr>
-              <w:t>Planung</w:t>
-            </w:r>
-            <w:r>
-              <w:rPr>
-                <w:sz w:val="17"/>
-              </w:rPr>
-              <w:br/>
-              <w:t>• Wähle einen Wunsch.</w:t>
-            </w:r>
-            <w:r>
-              <w:rPr>
-                <w:sz w:val="17"/>
-              </w:rPr>
-              <w:br/>
-              <w:t>• Bestimme zwei verschiedene Empfänger.</w:t>
-            </w:r>
-            <w:r>
-              <w:rPr>
-                <w:sz w:val="17"/>
-              </w:rPr>
-              <w:br/>
-              <w:t>• Überlege, was beide Personen wissen müssen.</w:t>
-            </w:r>
-          </w:p>
-        </w:tc>
-      </w:tr>
-    </w:tbl>
-    <w:p>
-      <w:pPr>
-        <w:spacing w:after="0"/>
-      </w:pPr>
-    </w:p>
-    <w:tbl>
-      <w:tblPr>
-        <w:tblW w:type="auto" w:w="0"/>
-        <w:jc w:val="center"/>
-        <w:tblLook w:firstColumn="1" w:firstRow="1" w:lastColumn="0" w:lastRow="0" w:noHBand="0" w:noVBand="1" w:val="04A0"/>
-      </w:tblPr>
-      <w:tblGrid>
-        <w:gridCol w:w="7483"/>
-      </w:tblGrid>
-      <w:tr>
-        <w:tc>
-          <w:tcPr>
-            <w:tcW w:type="dxa" w:w="7483"/>
-            <w:shd w:fill="F8EEE7"/>
-            <w:tcMar>
-              <w:top w:w="45" w:type="dxa"/>
-              <w:start w:w="70" w:type="dxa"/>
-              <w:bottom w:w="45" w:type="dxa"/>
-              <w:end w:w="70" w:type="dxa"/>
-            </w:tcMar>
-          </w:tcPr>
-          <w:p>
-            <w:pPr>
-              <w:spacing w:after="0"/>
-            </w:pPr>
-            <w:r>
-              <w:rPr>
-                <w:b/>
-                <w:color w:val="D97A4A"/>
-              </w:rPr>
-              <w:t>Durchführung</w:t>
-            </w:r>
-            <w:r>
-              <w:rPr>
-                <w:sz w:val="17"/>
-              </w:rPr>
-              <w:br/>
-              <w:t>• Schreibe zwei kurze Briefe.</w:t>
-            </w:r>
-            <w:r>
-              <w:rPr>
-                <w:sz w:val="17"/>
-              </w:rPr>
-              <w:br/>
-              <w:t>• Passe Anrede, Ton und Begründung an.</w:t>
-            </w:r>
-            <w:r>
-              <w:rPr>
-                <w:sz w:val="17"/>
-              </w:rPr>
-              <w:br/>
-              <w:t>• Markiere die wichtigsten Unterschiede.</w:t>
-            </w:r>
-          </w:p>
-        </w:tc>
-      </w:tr>
-    </w:tbl>
-    <w:p>
-      <w:pPr>
-        <w:spacing w:after="0"/>
-      </w:pPr>
-    </w:p>
-    <w:tbl>
-      <w:tblPr>
-        <w:tblW w:type="auto" w:w="0"/>
-        <w:jc w:val="center"/>
-        <w:tblLook w:firstColumn="1" w:firstRow="1" w:lastColumn="0" w:lastRow="0" w:noHBand="0" w:noVBand="1" w:val="04A0"/>
-      </w:tblPr>
-      <w:tblGrid>
-        <w:gridCol w:w="7483"/>
-      </w:tblGrid>
-      <w:tr>
-        <w:tc>
-          <w:tcPr>
-            <w:tcW w:type="dxa" w:w="7483"/>
-            <w:shd w:fill="EDF5EA"/>
-            <w:tcMar>
-              <w:top w:w="45" w:type="dxa"/>
-              <w:start w:w="70" w:type="dxa"/>
-              <w:bottom w:w="45" w:type="dxa"/>
-              <w:end w:w="70" w:type="dxa"/>
-            </w:tcMar>
-          </w:tcPr>
-          <w:p>
-            <w:pPr>
-              <w:spacing w:after="0"/>
-            </w:pPr>
-            <w:r>
-              <w:rPr>
-                <w:b/>
-                <w:color w:val="4D8B3F"/>
-              </w:rPr>
-              <w:t>Reflexion</w:t>
-            </w:r>
-            <w:r>
-              <w:rPr>
-                <w:sz w:val="17"/>
-              </w:rPr>
-              <w:br/>
-              <w:t>• Welcher Brief klingt formeller?</w:t>
-            </w:r>
-            <w:r>
-              <w:rPr>
-                <w:sz w:val="17"/>
-              </w:rPr>
-              <w:br/>
-              <w:t>• Welche Begründung passt zu welchem Empfänger?</w:t>
-            </w:r>
-            <w:r>
-              <w:rPr>
-                <w:sz w:val="17"/>
-              </w:rPr>
-              <w:br/>
-              <w:t>• Was blieb in beiden Briefen gleich?</w:t>
-            </w:r>
-          </w:p>
-        </w:tc>
-      </w:tr>
-    </w:tbl>
-    <w:p>
-      <w:pPr>
-        <w:spacing w:after="0"/>
-      </w:pPr>
     </w:p>
     <w:p>
       <w:pPr>
         <w:pStyle w:val="Heading2"/>
       </w:pPr>
       <w:r>
-        <w:t>Das soll dein Ergebnis können</w:t>
+        <w:t>Durchführung</w:t>
       </w:r>
     </w:p>
     <w:p>
-      <w:pPr>
-        <w:spacing w:after="20" w:line="240" w:lineRule="auto"/>
-      </w:pPr>
       <w:r>
-        <w:rPr>
-          <w:b/>
-        </w:rPr>
-        <w:t xml:space="preserve">• </w:t>
+        <w:t>Schreibe zwei richtige Sätze zu den Zahlen. Schreibe dann einen vollständigen Brief zu deinem Wunsch. Nutze darin einen Satz zu den Zahlen und einen sachlichen Grund.</w:t>
       </w:r>
-      <w:r>
-        <w:rPr>
-          <w:sz w:val="17"/>
-        </w:rPr>
-        <w:t>beide Briefe vollständig</w:t>
-      </w:r>
-    </w:p>
-    <w:p>
-      <w:pPr>
-        <w:spacing w:after="20" w:line="240" w:lineRule="auto"/>
-      </w:pPr>
-      <w:r>
-        <w:rPr>
-          <w:b/>
-        </w:rPr>
-        <w:t xml:space="preserve">• </w:t>
-      </w:r>
-      <w:r>
-        <w:rPr>
-          <w:sz w:val="17"/>
-        </w:rPr>
-        <w:t>Empfänger klar unterschieden</w:t>
-      </w:r>
-    </w:p>
-    <w:p>
-      <w:pPr>
-        <w:spacing w:after="20" w:line="240" w:lineRule="auto"/>
-      </w:pPr>
-      <w:r>
-        <w:rPr>
-          <w:b/>
-        </w:rPr>
-        <w:t xml:space="preserve">• </w:t>
-      </w:r>
-      <w:r>
-        <w:rPr>
-          <w:sz w:val="17"/>
-        </w:rPr>
-        <w:t>Anrede und Ton passend</w:t>
-      </w:r>
-    </w:p>
-    <w:p>
-      <w:pPr>
-        <w:spacing w:after="20" w:line="240" w:lineRule="auto"/>
-      </w:pPr>
-      <w:r>
-        <w:rPr>
-          <w:b/>
-        </w:rPr>
-        <w:t xml:space="preserve">• </w:t>
-      </w:r>
-      <w:r>
-        <w:rPr>
-          <w:sz w:val="17"/>
-        </w:rPr>
-        <w:t>Wunsch bleibt gleich</w:t>
-      </w:r>
-    </w:p>
-    <w:p>
-      <w:pPr>
-        <w:spacing w:after="20" w:line="240" w:lineRule="auto"/>
-      </w:pPr>
-      <w:r>
-        <w:rPr>
-          <w:b/>
-        </w:rPr>
-        <w:t xml:space="preserve">• </w:t>
-      </w:r>
-      <w:r>
-        <w:rPr>
-          <w:sz w:val="17"/>
-        </w:rPr>
-        <w:t>Unterschiede erklärt</w:t>
-      </w:r>
-    </w:p>
-    <w:tbl>
-      <w:tblPr>
-        <w:tblW w:type="auto" w:w="0"/>
-        <w:jc w:val="center"/>
-        <w:tblLook w:firstColumn="1" w:firstRow="1" w:lastColumn="0" w:lastRow="0" w:noHBand="0" w:noVBand="1" w:val="04A0"/>
-      </w:tblPr>
-      <w:tblGrid>
-        <w:gridCol w:w="7483"/>
-      </w:tblGrid>
-      <w:tr>
-        <w:tc>
-          <w:tcPr>
-            <w:tcW w:type="dxa" w:w="7483"/>
-            <w:shd w:fill="EEF2F4"/>
-            <w:tcMar>
-              <w:top w:w="80" w:type="dxa"/>
-              <w:start w:w="100" w:type="dxa"/>
-              <w:bottom w:w="80" w:type="dxa"/>
-              <w:end w:w="100" w:type="dxa"/>
-            </w:tcMar>
-          </w:tcPr>
-          <w:p>
-            <w:pPr>
-              <w:spacing w:after="0"/>
-            </w:pPr>
-            <w:r>
-              <w:rPr>
-                <w:b/>
-                <w:color w:val="3E5668"/>
-                <w:sz w:val="19"/>
-              </w:rPr>
-              <w:t>Du kannst nutzen</w:t>
-            </w:r>
-            <w:r>
-              <w:br/>
-              <w:t>Merkblätter zu Anrede, Wunschformulierung und Briefaufbau</w:t>
-            </w:r>
-          </w:p>
-        </w:tc>
-      </w:tr>
-    </w:tbl>
-    <w:p>
-      <w:pPr>
-        <w:spacing w:after="20"/>
-      </w:pPr>
-    </w:p>
-    <w:p>
-      <w:r>
-        <w:br w:type="page"/>
-      </w:r>
-    </w:p>
-    <w:p>
-      <w:pPr>
-        <w:spacing w:after="20"/>
-        <w:jc w:val="center"/>
-      </w:pPr>
-      <w:r>
-        <w:rPr>
-          <w:b/>
-          <w:color w:val="3E5668"/>
-          <w:sz w:val="29"/>
-        </w:rPr>
-        <w:t>Projekt 6 – Digitaler Wunschbrief</w:t>
-      </w:r>
-    </w:p>
-    <w:p>
-      <w:pPr>
-        <w:spacing w:after="80"/>
-        <w:jc w:val="center"/>
-      </w:pPr>
-      <w:r>
-        <w:rPr>
-          <w:i/>
-          <w:color w:val="D97A4A"/>
-          <w:sz w:val="17"/>
-        </w:rPr>
-        <w:t>Freiwilliges Projekt</w:t>
-      </w:r>
-    </w:p>
-    <w:tbl>
-      <w:tblPr>
-        <w:tblW w:type="auto" w:w="0"/>
-        <w:jc w:val="center"/>
-        <w:tblLook w:firstColumn="1" w:firstRow="1" w:lastColumn="0" w:lastRow="0" w:noHBand="0" w:noVBand="1" w:val="04A0"/>
-      </w:tblPr>
-      <w:tblGrid>
-        <w:gridCol w:w="7483"/>
-      </w:tblGrid>
-      <w:tr>
-        <w:tc>
-          <w:tcPr>
-            <w:tcW w:type="dxa" w:w="7483"/>
-            <w:shd w:fill="FBF5E2"/>
-            <w:tcMar>
-              <w:top w:w="80" w:type="dxa"/>
-              <w:start w:w="100" w:type="dxa"/>
-              <w:bottom w:w="80" w:type="dxa"/>
-              <w:end w:w="100" w:type="dxa"/>
-            </w:tcMar>
-          </w:tcPr>
-          <w:p>
-            <w:pPr>
-              <w:spacing w:after="0"/>
-            </w:pPr>
-            <w:r>
-              <w:rPr>
-                <w:b/>
-                <w:color w:val="C17B00"/>
-                <w:sz w:val="19"/>
-              </w:rPr>
-              <w:t>Dein Produkt</w:t>
-            </w:r>
-            <w:r>
-              <w:br/>
-              <w:t>Du erstellst am Laptop eine sauber gestaltete digitale Version eines Wunschbriefes.</w:t>
-            </w:r>
-          </w:p>
-        </w:tc>
-      </w:tr>
-    </w:tbl>
-    <w:p>
-      <w:pPr>
-        <w:spacing w:after="20"/>
-      </w:pPr>
-    </w:p>
-    <w:tbl>
-      <w:tblPr>
-        <w:tblW w:type="auto" w:w="0"/>
-        <w:jc w:val="center"/>
-        <w:tblLook w:firstColumn="1" w:firstRow="1" w:lastColumn="0" w:lastRow="0" w:noHBand="0" w:noVBand="1" w:val="04A0"/>
-      </w:tblPr>
-      <w:tblGrid>
-        <w:gridCol w:w="7483"/>
-      </w:tblGrid>
-      <w:tr>
-        <w:tc>
-          <w:tcPr>
-            <w:tcW w:type="dxa" w:w="7483"/>
-            <w:shd w:fill="EEF2F4"/>
-            <w:tcMar>
-              <w:top w:w="45" w:type="dxa"/>
-              <w:start w:w="70" w:type="dxa"/>
-              <w:bottom w:w="45" w:type="dxa"/>
-              <w:end w:w="70" w:type="dxa"/>
-            </w:tcMar>
-          </w:tcPr>
-          <w:p>
-            <w:pPr>
-              <w:spacing w:after="0"/>
-            </w:pPr>
-            <w:r>
-              <w:rPr>
-                <w:b/>
-                <w:color w:val="3E5668"/>
-              </w:rPr>
-              <w:t>Planung</w:t>
-            </w:r>
-            <w:r>
-              <w:rPr>
-                <w:sz w:val="17"/>
-              </w:rPr>
-              <w:br/>
-              <w:t>• Wähle einen bereits geschriebenen Brief.</w:t>
-            </w:r>
-            <w:r>
-              <w:rPr>
-                <w:sz w:val="17"/>
-              </w:rPr>
-              <w:br/>
-              <w:t>• Markiere Stellen, die du verbessern möchtest.</w:t>
-            </w:r>
-            <w:r>
-              <w:rPr>
-                <w:sz w:val="17"/>
-              </w:rPr>
-              <w:br/>
-              <w:t>• Plane eine übersichtliche Gestaltung.</w:t>
-            </w:r>
-          </w:p>
-        </w:tc>
-      </w:tr>
-    </w:tbl>
-    <w:p>
-      <w:pPr>
-        <w:spacing w:after="0"/>
-      </w:pPr>
-    </w:p>
-    <w:tbl>
-      <w:tblPr>
-        <w:tblW w:type="auto" w:w="0"/>
-        <w:jc w:val="center"/>
-        <w:tblLook w:firstColumn="1" w:firstRow="1" w:lastColumn="0" w:lastRow="0" w:noHBand="0" w:noVBand="1" w:val="04A0"/>
-      </w:tblPr>
-      <w:tblGrid>
-        <w:gridCol w:w="7483"/>
-      </w:tblGrid>
-      <w:tr>
-        <w:tc>
-          <w:tcPr>
-            <w:tcW w:type="dxa" w:w="7483"/>
-            <w:shd w:fill="F8EEE7"/>
-            <w:tcMar>
-              <w:top w:w="45" w:type="dxa"/>
-              <w:start w:w="70" w:type="dxa"/>
-              <w:bottom w:w="45" w:type="dxa"/>
-              <w:end w:w="70" w:type="dxa"/>
-            </w:tcMar>
-          </w:tcPr>
-          <w:p>
-            <w:pPr>
-              <w:spacing w:after="0"/>
-            </w:pPr>
-            <w:r>
-              <w:rPr>
-                <w:b/>
-                <w:color w:val="D97A4A"/>
-              </w:rPr>
-              <w:t>Durchführung</w:t>
-            </w:r>
-            <w:r>
-              <w:rPr>
-                <w:sz w:val="17"/>
-              </w:rPr>
-              <w:br/>
-              <w:t>• Tippe den Brief ab.</w:t>
-            </w:r>
-            <w:r>
-              <w:rPr>
-                <w:sz w:val="17"/>
-              </w:rPr>
-              <w:br/>
-              <w:t>• Verbessere Formulierungen und Rechtschreibung.</w:t>
-            </w:r>
-            <w:r>
-              <w:rPr>
-                <w:sz w:val="17"/>
-              </w:rPr>
-              <w:br/>
-              <w:t>• Achte auf Absätze, Schriftgröße und Lesbarkeit.</w:t>
-            </w:r>
-            <w:r>
-              <w:rPr>
-                <w:sz w:val="17"/>
-              </w:rPr>
-              <w:br/>
-              <w:t>• Speichere die Datei mit einem passenden Namen.</w:t>
-            </w:r>
-          </w:p>
-        </w:tc>
-      </w:tr>
-    </w:tbl>
-    <w:p>
-      <w:pPr>
-        <w:spacing w:after="0"/>
-      </w:pPr>
-    </w:p>
-    <w:tbl>
-      <w:tblPr>
-        <w:tblW w:type="auto" w:w="0"/>
-        <w:jc w:val="center"/>
-        <w:tblLook w:firstColumn="1" w:firstRow="1" w:lastColumn="0" w:lastRow="0" w:noHBand="0" w:noVBand="1" w:val="04A0"/>
-      </w:tblPr>
-      <w:tblGrid>
-        <w:gridCol w:w="7483"/>
-      </w:tblGrid>
-      <w:tr>
-        <w:tc>
-          <w:tcPr>
-            <w:tcW w:type="dxa" w:w="7483"/>
-            <w:shd w:fill="EDF5EA"/>
-            <w:tcMar>
-              <w:top w:w="45" w:type="dxa"/>
-              <w:start w:w="70" w:type="dxa"/>
-              <w:bottom w:w="45" w:type="dxa"/>
-              <w:end w:w="70" w:type="dxa"/>
-            </w:tcMar>
-          </w:tcPr>
-          <w:p>
-            <w:pPr>
-              <w:spacing w:after="0"/>
-            </w:pPr>
-            <w:r>
-              <w:rPr>
-                <w:b/>
-                <w:color w:val="4D8B3F"/>
-              </w:rPr>
-              <w:t>Reflexion</w:t>
-            </w:r>
-            <w:r>
-              <w:rPr>
-                <w:sz w:val="17"/>
-              </w:rPr>
-              <w:br/>
-              <w:t>• Welche Verbesserungen sind sichtbar?</w:t>
-            </w:r>
-            <w:r>
-              <w:rPr>
-                <w:sz w:val="17"/>
-              </w:rPr>
-              <w:br/>
-              <w:t>• Ist die digitale Version leichter zu lesen?</w:t>
-            </w:r>
-            <w:r>
-              <w:rPr>
-                <w:sz w:val="17"/>
-              </w:rPr>
-              <w:br/>
-              <w:t>• Welche Stelle gefällt dir besonders?</w:t>
-            </w:r>
-          </w:p>
-        </w:tc>
-      </w:tr>
-    </w:tbl>
-    <w:p>
-      <w:pPr>
-        <w:spacing w:after="0"/>
-      </w:pPr>
     </w:p>
     <w:p>
       <w:pPr>
         <w:pStyle w:val="Heading2"/>
       </w:pPr>
       <w:r>
-        <w:t>Das soll dein Ergebnis können</w:t>
+        <w:t>Reflexion</w:t>
+      </w:r>
+    </w:p>
+    <w:p>
+      <w:r>
+        <w:t>Erkläre: Was zeigen die Zahlen? Was sagen sie nicht über die ganze Schule?</w:t>
       </w:r>
     </w:p>
     <w:p>
       <w:pPr>
-        <w:spacing w:after="20" w:line="240" w:lineRule="auto"/>
+        <w:shd w:fill="EEF2F4"/>
       </w:pPr>
       <w:r>
         <w:rPr>
           <w:b/>
         </w:rPr>
-        <w:t xml:space="preserve">• </w:t>
+        <w:t>Prüfe</w:t>
+        <w:br/>
       </w:r>
       <w:r>
-        <w:rPr>
-          <w:sz w:val="17"/>
-        </w:rPr>
-        <w:t>vollständiger Briefaufbau</w:t>
+        <w:t>Deine Zahlen stimmen. Dein Grund erklärt einen Nutzen. Du behauptest nicht, dass die ganze Schule befragt wurde.</w:t>
+      </w:r>
+    </w:p>
+    <w:p>
+      <w:r>
+        <w:t>Hilfe: Beginne: „In der Beispielklasse …“ Die Zahlen sind erfunden, keine echte Klassenumfrage.</w:t>
       </w:r>
     </w:p>
     <w:p>
       <w:pPr>
-        <w:spacing w:after="20" w:line="240" w:lineRule="auto"/>
+        <w:pStyle w:val="Title"/>
+        <w:pageBreakBefore/>
+      </w:pPr>
+      <w:r>
+        <w:t>Projekt 3 · freiwillig</w:t>
+      </w:r>
+    </w:p>
+    <w:p>
+      <w:pPr>
+        <w:pStyle w:val="Heading1"/>
+      </w:pPr>
+      <w:r>
+        <w:t>Eine Idee für einen Schulort</w:t>
+      </w:r>
+    </w:p>
+    <w:p>
+      <w:pPr>
+        <w:shd w:fill="EEF2F4"/>
       </w:pPr>
       <w:r>
         <w:rPr>
           <w:b/>
         </w:rPr>
-        <w:t xml:space="preserve">• </w:t>
+        <w:t>Dein Ergebnis</w:t>
+        <w:br/>
       </w:r>
       <w:r>
-        <w:rPr>
-          <w:sz w:val="17"/>
-        </w:rPr>
-        <w:t>gut lesbare Gestaltung</w:t>
+        <w:t>Eine Projektseite mit Skizze und kurzem Brief.</w:t>
+      </w:r>
+    </w:p>
+    <w:p>
+      <w:r>
+        <w:t>Material: Papier, Stifte, Merkblätter 2 und 4.</w:t>
       </w:r>
     </w:p>
     <w:p>
       <w:pPr>
-        <w:spacing w:after="20" w:line="240" w:lineRule="auto"/>
+        <w:pStyle w:val="Heading2"/>
+      </w:pPr>
+      <w:r>
+        <w:t>Planung</w:t>
+      </w:r>
+    </w:p>
+    <w:p>
+      <w:r>
+        <w:t>Wähle einen Ort an der Schule. Beschreibe ein Problem. Sammle zwei mögliche Lösungen.</w:t>
+      </w:r>
+    </w:p>
+    <w:p>
+      <w:pPr>
+        <w:pStyle w:val="Heading2"/>
+      </w:pPr>
+      <w:r>
+        <w:t>Durchführung</w:t>
+      </w:r>
+    </w:p>
+    <w:p>
+      <w:r>
+        <w:t>Vergleiche die Lösungen: Was hilft? Was könnte schwierig sein? Wähle eine Lösung. Zeichne sie und beschrifte sie. Schreibe dazu einen vollständigen Wunschbrief.</w:t>
+      </w:r>
+    </w:p>
+    <w:p>
+      <w:pPr>
+        <w:pStyle w:val="Heading2"/>
+      </w:pPr>
+      <w:r>
+        <w:t>Reflexion</w:t>
+      </w:r>
+    </w:p>
+    <w:p>
+      <w:r>
+        <w:t>Nenne ein Bedenken gegen deine Wahl. Erkläre, wie du damit umgehen möchtest.</w:t>
+      </w:r>
+    </w:p>
+    <w:p>
+      <w:pPr>
+        <w:shd w:fill="EEF2F4"/>
       </w:pPr>
       <w:r>
         <w:rPr>
           <w:b/>
         </w:rPr>
-        <w:t xml:space="preserve">• </w:t>
+        <w:t>Prüfe</w:t>
+        <w:br/>
       </w:r>
       <w:r>
-        <w:rPr>
-          <w:sz w:val="17"/>
-        </w:rPr>
-        <w:t>sorgfältig überarbeitet</w:t>
+        <w:t>Ort und Problem sind klar. Du erklärst deine Wahl. Deine Skizze und dein Brief zeigen dieselbe Idee.</w:t>
+      </w:r>
+    </w:p>
+    <w:p>
+      <w:r>
+        <w:t>Hilfe: Du kannst eine kurze Probephase vorschlagen. Verlasse den Raum nur nach Absprache.</w:t>
       </w:r>
     </w:p>
     <w:p>
       <w:pPr>
-        <w:spacing w:after="20" w:line="240" w:lineRule="auto"/>
+        <w:pStyle w:val="Title"/>
+        <w:pageBreakBefore/>
+      </w:pPr>
+      <w:r>
+        <w:t>Projekt 4 · freiwillig</w:t>
+      </w:r>
+    </w:p>
+    <w:p>
+      <w:pPr>
+        <w:pStyle w:val="Heading1"/>
+      </w:pPr>
+      <w:r>
+        <w:t>Ein verständliches Wunschposter</w:t>
+      </w:r>
+    </w:p>
+    <w:p>
+      <w:pPr>
+        <w:shd w:fill="EEF2F4"/>
       </w:pPr>
       <w:r>
         <w:rPr>
           <w:b/>
         </w:rPr>
-        <w:t xml:space="preserve">• </w:t>
+        <w:t>Dein Ergebnis</w:t>
+        <w:br/>
       </w:r>
       <w:r>
-        <w:rPr>
-          <w:sz w:val="17"/>
-        </w:rPr>
-        <w:t>sinnvoller Dateiname</w:t>
+        <w:t>Ein Poster aus Papier für eine kleine Ausstellung.</w:t>
+      </w:r>
+    </w:p>
+    <w:p>
+      <w:r>
+        <w:t>Material: A3-Papier, Stifte, Datenkarte.</w:t>
       </w:r>
     </w:p>
     <w:p>
       <w:pPr>
-        <w:spacing w:after="20" w:line="240" w:lineRule="auto"/>
+        <w:pStyle w:val="Heading2"/>
+      </w:pPr>
+      <w:r>
+        <w:t>Planung</w:t>
+      </w:r>
+    </w:p>
+    <w:p>
+      <w:r>
+        <w:t>Wähle einen Wunsch aus der Datenkarte. Plane Platz für Überschrift, Zahl, Erklärung und eine freundliche Bitte.</w:t>
+      </w:r>
+    </w:p>
+    <w:p>
+      <w:pPr>
+        <w:pStyle w:val="Heading2"/>
+      </w:pPr>
+      <w:r>
+        <w:t>Durchführung</w:t>
+      </w:r>
+    </w:p>
+    <w:p>
+      <w:r>
+        <w:t>Gestalte dein Poster. Nenne die richtige Zahl und die Beispielklasse. Ergänze einen Nutzen deines Wunsches. Die Bitte soll zeigen, was du erreichen möchtest.</w:t>
+      </w:r>
+    </w:p>
+    <w:p>
+      <w:pPr>
+        <w:pStyle w:val="Heading2"/>
+      </w:pPr>
+      <w:r>
+        <w:t>Reflexion</w:t>
+      </w:r>
+    </w:p>
+    <w:p>
+      <w:r>
+        <w:t>Zeige das Poster einem Partnerkind. Frage: „Was wünsche ich mir? Was zeigt die Zahl?“ Verbessere nur unklare Stellen.</w:t>
+      </w:r>
+    </w:p>
+    <w:p>
+      <w:pPr>
+        <w:shd w:fill="EEF2F4"/>
       </w:pPr>
       <w:r>
         <w:rPr>
           <w:b/>
         </w:rPr>
-        <w:t xml:space="preserve">• </w:t>
+        <w:t>Prüfe</w:t>
+        <w:br/>
       </w:r>
       <w:r>
-        <w:rPr>
-          <w:sz w:val="17"/>
-        </w:rPr>
-        <w:t>keine unnötigen Effekte</w:t>
+        <w:t>Dein Wunsch ist schnell erkennbar. Die Zahl passt dazu. Die Schrift ist lesbar. Die Daten sind als Beispiel markiert.</w:t>
       </w:r>
     </w:p>
-    <w:tbl>
-      <w:tblPr>
-        <w:tblW w:type="auto" w:w="0"/>
-        <w:jc w:val="center"/>
-        <w:tblLook w:firstColumn="1" w:firstRow="1" w:lastColumn="0" w:lastRow="0" w:noHBand="0" w:noVBand="1" w:val="04A0"/>
-      </w:tblPr>
-      <w:tblGrid>
-        <w:gridCol w:w="7483"/>
-      </w:tblGrid>
-      <w:tr>
-        <w:tc>
-          <w:tcPr>
-            <w:tcW w:type="dxa" w:w="7483"/>
-            <w:shd w:fill="EEF2F4"/>
-            <w:tcMar>
-              <w:top w:w="80" w:type="dxa"/>
-              <w:start w:w="100" w:type="dxa"/>
-              <w:bottom w:w="80" w:type="dxa"/>
-              <w:end w:w="100" w:type="dxa"/>
-            </w:tcMar>
-          </w:tcPr>
-          <w:p>
-            <w:pPr>
-              <w:spacing w:after="0"/>
-            </w:pPr>
-            <w:r>
-              <w:rPr>
-                <w:b/>
-                <w:color w:val="3E5668"/>
-                <w:sz w:val="19"/>
-              </w:rPr>
-              <w:t>Du kannst nutzen</w:t>
-            </w:r>
-            <w:r>
-              <w:br/>
-              <w:t>Laptop, Textverarbeitung, Kontroll-Kiosk und Checkliste</w:t>
-            </w:r>
-          </w:p>
-        </w:tc>
-      </w:tr>
-    </w:tbl>
+    <w:p>
+      <w:r>
+        <w:t>Hilfe: Ein Diagramm ist möglich, aber nicht nötig. Eine klar erklärte Zahl reicht.</w:t>
+      </w:r>
+    </w:p>
     <w:p>
       <w:pPr>
-        <w:spacing w:after="20"/>
+        <w:pStyle w:val="Title"/>
+        <w:pageBreakBefore/>
       </w:pPr>
+      <w:r>
+        <w:t>Projekt 5 · freiwillig</w:t>
+      </w:r>
+    </w:p>
+    <w:p>
+      <w:pPr>
+        <w:pStyle w:val="Heading1"/>
+      </w:pPr>
+      <w:r>
+        <w:t>Zwei Briefe, zwei Empfänger</w:t>
+      </w:r>
+    </w:p>
+    <w:p>
+      <w:pPr>
+        <w:shd w:fill="EEF2F4"/>
+      </w:pPr>
+      <w:r>
+        <w:rPr>
+          <w:b/>
+        </w:rPr>
+        <w:t>Dein Ergebnis</w:t>
+        <w:br/>
+      </w:r>
+      <w:r>
+        <w:t>Zwei kurze Briefe mit demselben Wunsch.</w:t>
+      </w:r>
+    </w:p>
+    <w:p>
+      <w:r>
+        <w:t>Material: Heft, Merkblätter 2 und 3.</w:t>
+      </w:r>
+    </w:p>
+    <w:p>
+      <w:pPr>
+        <w:pStyle w:val="Heading2"/>
+      </w:pPr>
+      <w:r>
+        <w:t>Planung</w:t>
+      </w:r>
+    </w:p>
+    <w:p>
+      <w:r>
+        <w:t>Wähle einen Wunsch. Schreibe an ein Kind aus der Schülervertretung und an die Schulleitung. Überlege, wie beide helfen könnten.</w:t>
+      </w:r>
+    </w:p>
+    <w:p>
+      <w:pPr>
+        <w:pStyle w:val="Heading2"/>
+      </w:pPr>
+      <w:r>
+        <w:t>Durchführung</w:t>
+      </w:r>
+    </w:p>
+    <w:p>
+      <w:r>
+        <w:t>Schreibe zwei vollständige Briefe. Passe Anrede, Erklärung und konkrete Bitte an die Person an. Tausche nicht nur die Namen aus.</w:t>
+      </w:r>
+    </w:p>
+    <w:p>
+      <w:pPr>
+        <w:pStyle w:val="Heading2"/>
+      </w:pPr>
+      <w:r>
+        <w:t>Reflexion</w:t>
+      </w:r>
+    </w:p>
+    <w:p>
+      <w:r>
+        <w:t>Markiere zwei wichtige Unterschiede. Erkläre mündlich, warum du sie gewählt hast.</w:t>
+      </w:r>
+    </w:p>
+    <w:p>
+      <w:pPr>
+        <w:shd w:fill="EEF2F4"/>
+      </w:pPr>
+      <w:r>
+        <w:rPr>
+          <w:b/>
+        </w:rPr>
+        <w:t>Prüfe</w:t>
+        <w:br/>
+      </w:r>
+      <w:r>
+        <w:t>Der Wunsch bleibt gleich. Beide Personen werden passend angesprochen. Ihre unterschiedlichen Aufgaben werden deutlich.</w:t>
+      </w:r>
+    </w:p>
+    <w:p>
+      <w:r>
+        <w:t>Hilfe: Die Schülervertretung kann Wünsche sammeln. Die Schulleitung kann Möglichkeiten prüfen. Zusagen darfst du nicht erfinden.</w:t>
+      </w:r>
+    </w:p>
+    <w:p>
+      <w:pPr>
+        <w:pStyle w:val="Title"/>
+        <w:pageBreakBefore/>
+      </w:pPr>
+      <w:r>
+        <w:t>Projekt 6 · freiwillig</w:t>
+      </w:r>
+    </w:p>
+    <w:p>
+      <w:pPr>
+        <w:pStyle w:val="Heading1"/>
+      </w:pPr>
+      <w:r>
+        <w:t>Auf eine Antwort reagieren</w:t>
+      </w:r>
+    </w:p>
+    <w:p>
+      <w:pPr>
+        <w:shd w:fill="EEF2F4"/>
+      </w:pPr>
+      <w:r>
+        <w:rPr>
+          <w:b/>
+        </w:rPr>
+        <w:t>Dein Ergebnis</w:t>
+        <w:br/>
+      </w:r>
+      <w:r>
+        <w:t>Ein Antwortbrief mit einem überarbeiteten Vorschlag.</w:t>
+      </w:r>
+    </w:p>
+    <w:p>
+      <w:r>
+        <w:t>Material: Heft, Merkblätter 2 und 3.</w:t>
+      </w:r>
+    </w:p>
+    <w:p>
+      <w:pPr>
+        <w:pStyle w:val="Heading2"/>
+      </w:pPr>
+      <w:r>
+        <w:t>Planung</w:t>
+      </w:r>
+    </w:p>
+    <w:p>
+      <w:r>
+        <w:t>Lies die Antwort: „Eine Spieleausleihe ist interessant. Uns fehlen aber Geld und Personen für die Ausgabe. Wie könnte ein kleiner Versuch aussehen?“</w:t>
+      </w:r>
+    </w:p>
+    <w:p>
+      <w:pPr>
+        <w:pStyle w:val="Heading2"/>
+      </w:pPr>
+      <w:r>
+        <w:t>Durchführung</w:t>
+      </w:r>
+    </w:p>
+    <w:p>
+      <w:r>
+        <w:t>Plane einen Versuch mit vorhandenen Spielen. Wer könnte freiwillig helfen? Schreibe einen vollständigen Antwortbrief. Bedanke dich und gehe auf beide Schwierigkeiten ein.</w:t>
+      </w:r>
+    </w:p>
+    <w:p>
+      <w:pPr>
+        <w:pStyle w:val="Heading2"/>
+      </w:pPr>
+      <w:r>
+        <w:t>Reflexion</w:t>
+      </w:r>
+    </w:p>
+    <w:p>
+      <w:r>
+        <w:t>Prüfe: Was müsste noch abgesprochen werden? Kennzeichne Ideen als Vorschlag, nicht als feste Zusage.</w:t>
+      </w:r>
+    </w:p>
+    <w:p>
+      <w:pPr>
+        <w:shd w:fill="EEF2F4"/>
+      </w:pPr>
+      <w:r>
+        <w:rPr>
+          <w:b/>
+        </w:rPr>
+        <w:t>Prüfe</w:t>
+        <w:br/>
+      </w:r>
+      <w:r>
+        <w:t>Du gehst auf Geld und Ausgabe ein. Dein Versuch ist konkret. Du versprichst nichts für andere Personen.</w:t>
+      </w:r>
+    </w:p>
+    <w:p>
+      <w:r>
+        <w:t>Hilfe: Beginne: „Vielen Dank für Ihre Antwort. Ich schlage vor, …“ Die Antwort oben ist ein erfundenes Beispiel.</w:t>
+      </w:r>
+    </w:p>
+    <w:p>
+      <w:pPr>
+        <w:pStyle w:val="Title"/>
+        <w:pageBreakBefore/>
+      </w:pPr>
+      <w:r>
+        <w:t>Datenkarte</w:t>
+      </w:r>
+    </w:p>
+    <w:p>
+      <w:pPr>
+        <w:pStyle w:val="Heading1"/>
+      </w:pPr>
+      <w:r>
+        <w:t>Für Projekt 2 und 4</w:t>
+      </w:r>
+    </w:p>
+    <w:p>
+      <w:pPr>
+        <w:shd w:fill="EEF2F4"/>
+      </w:pPr>
+      <w:r>
+        <w:rPr>
+          <w:b/>
+        </w:rPr>
+        <w:t>Erfundene Beispielumfrage</w:t>
+        <w:br/>
+      </w:r>
+      <w:r>
+        <w:t>26 Kinder einer Beispielklasse wurden gefragt: „Welchen Wunsch sollen wir zuerst besprechen?“ Jedes Kind durfte genau einen Wunsch wählen.</w:t>
+      </w:r>
+    </w:p>
+    <w:p>
+      <w:r>
+        <w:t>Spieleausleihe: 9 Stimmen</w:t>
+      </w:r>
+    </w:p>
+    <w:p>
+      <w:r>
+        <w:t>Leseecke: 7 Stimmen</w:t>
+      </w:r>
+    </w:p>
+    <w:p>
+      <w:r>
+        <w:t>Sitzbänke: 6 Stimmen</w:t>
+      </w:r>
+    </w:p>
+    <w:p>
+      <w:r>
+        <w:t>Neue Bälle: 4 Stimmen</w:t>
+      </w:r>
+    </w:p>
+    <w:p>
+      <w:pPr>
+        <w:pStyle w:val="Heading2"/>
+      </w:pPr>
+      <w:r>
+        <w:t>Zusammen: 26 Stimmen.</w:t>
+      </w:r>
+    </w:p>
+    <w:p>
+      <w:pPr>
+        <w:shd w:fill="EEF2F4"/>
+      </w:pPr>
+      <w:r>
+        <w:rPr>
+          <w:b/>
+        </w:rPr>
+        <w:t>Das kannst du sagen</w:t>
+        <w:br/>
+      </w:r>
+      <w:r>
+        <w:t>9 von 26 Kindern der Beispielklasse haben die Spieleausleihe gewählt. Sie hat unter diesen vier Wünschen die meisten Stimmen.</w:t>
+      </w:r>
+    </w:p>
+    <w:p>
+      <w:pPr>
+        <w:shd w:fill="EEF2F4"/>
+      </w:pPr>
+      <w:r>
+        <w:rPr>
+          <w:b/>
+        </w:rPr>
+        <w:t>Das weißt du nicht</w:t>
+        <w:br/>
+      </w:r>
+      <w:r>
+        <w:t>Die Umfrage zeigt nicht, was alle Kinder der Schule möchten. Sie zeigt auch nicht, welche anderen Wünsche ein Kind noch gut findet.</w:t>
+      </w:r>
+    </w:p>
+    <w:p>
+      <w:r>
+        <w:t>Du darfst auch einen Wunsch mit weniger Stimmen wählen. Begründe, welchen Nutzen er hat.</w:t>
+      </w:r>
+    </w:p>
+    <w:p>
+      <w:r>
+        <w:t>Echte Klassendaten kannst du nach Absprache stattdessen nutzen. Notiere dann die Frage, die Zahl der Befragten und ob mehrere Antworten erlaubt waren.</w:t>
+      </w:r>
     </w:p>
     <w:sectPr>
       <w:pgSz w:w="8391" w:h="11906"/>
-      <w:pgMar w:top="369" w:right="454" w:bottom="369" w:left="454" w:header="720" w:footer="720" w:gutter="0"/>
+      <w:pgMar w:top="510" w:right="510" w:bottom="510" w:left="510" w:header="720" w:footer="720" w:gutter="0"/>
       <w:cols w:space="720"/>
       <w:docGrid w:linePitch="360"/>
     </w:sectPr>
@@ -3086,9 +1143,14 @@
     <w:name w:val="Normal"/>
     <w:qFormat/>
     <w:rsid w:val="00FC693F"/>
+    <w:pPr>
+      <w:keepNext w:val="0"/>
+      <w:spacing w:after="120" w:before="0" w:line="245" w:lineRule="auto"/>
+    </w:pPr>
     <w:rPr>
-      <w:rFonts w:ascii="Aptos" w:hAnsi="Aptos" w:eastAsia="Aptos"/>
-      <w:sz w:val="18"/>
+      <w:rFonts w:ascii="Arial" w:hAnsi="Arial"/>
+      <w:color w:val="24313A"/>
+      <w:sz w:val="28"/>
     </w:rPr>
   </w:style>
   <w:style w:type="paragraph" w:styleId="Header">
@@ -3146,15 +1208,15 @@
     <w:pPr>
       <w:keepNext/>
       <w:keepLines/>
-      <w:spacing w:before="480" w:after="0"/>
+      <w:spacing w:before="0" w:after="120" w:line="245" w:lineRule="auto"/>
       <w:outlineLvl w:val="0"/>
     </w:pPr>
     <w:rPr>
-      <w:rFonts w:asciiTheme="majorHAnsi" w:eastAsiaTheme="majorEastAsia" w:hAnsiTheme="majorHAnsi" w:cstheme="majorBidi" w:ascii="Aptos Display" w:hAnsi="Aptos Display" w:eastAsia="Aptos Display"/>
+      <w:rFonts w:asciiTheme="majorHAnsi" w:eastAsiaTheme="majorEastAsia" w:hAnsiTheme="majorHAnsi" w:cstheme="majorBidi" w:ascii="Arial" w:hAnsi="Arial"/>
       <w:b/>
       <w:bCs/>
-      <w:color w:val="3E5668"/>
-      <w:sz w:val="25"/>
+      <w:color w:val="24313A"/>
+      <w:sz w:val="32"/>
       <w:szCs w:val="28"/>
     </w:rPr>
   </w:style>
@@ -3170,15 +1232,15 @@
     <w:pPr>
       <w:keepNext/>
       <w:keepLines/>
-      <w:spacing w:before="200" w:after="0"/>
+      <w:spacing w:before="0" w:after="120" w:line="245" w:lineRule="auto"/>
       <w:outlineLvl w:val="1"/>
     </w:pPr>
     <w:rPr>
-      <w:rFonts w:asciiTheme="majorHAnsi" w:eastAsiaTheme="majorEastAsia" w:hAnsiTheme="majorHAnsi" w:cstheme="majorBidi" w:ascii="Aptos Display" w:hAnsi="Aptos Display" w:eastAsia="Aptos Display"/>
+      <w:rFonts w:asciiTheme="majorHAnsi" w:eastAsiaTheme="majorEastAsia" w:hAnsiTheme="majorHAnsi" w:cstheme="majorBidi" w:ascii="Arial" w:hAnsi="Arial"/>
       <w:b/>
       <w:bCs/>
-      <w:color w:val="D97A4A"/>
-      <w:sz w:val="20"/>
+      <w:color w:val="24313A"/>
+      <w:sz w:val="28"/>
       <w:szCs w:val="26"/>
     </w:rPr>
   </w:style>
@@ -3432,19 +1494,19 @@
     <w:qFormat/>
     <w:rsid w:val="00FC693F"/>
     <w:pPr>
+      <w:keepNext/>
       <w:pBdr>
         <w:bottom w:val="single" w:sz="8" w:space="4" w:color="4F81BD" w:themeColor="accent1"/>
       </w:pBdr>
-      <w:spacing w:after="300" w:line="240" w:lineRule="auto"/>
+      <w:spacing w:after="120" w:line="245" w:lineRule="auto" w:before="0"/>
       <w:contextualSpacing/>
     </w:pPr>
     <w:rPr>
-      <w:rFonts w:asciiTheme="majorHAnsi" w:eastAsiaTheme="majorEastAsia" w:hAnsiTheme="majorHAnsi" w:cstheme="majorBidi" w:ascii="Aptos Display" w:hAnsi="Aptos Display" w:eastAsia="Aptos Display"/>
-      <w:b/>
-      <w:color w:val="3E5668"/>
+      <w:rFonts w:asciiTheme="majorHAnsi" w:eastAsiaTheme="majorEastAsia" w:hAnsiTheme="majorHAnsi" w:cstheme="majorBidi" w:ascii="Arial" w:hAnsi="Arial"/>
+      <w:color w:val="24313A"/>
       <w:spacing w:val="5"/>
       <w:kern w:val="28"/>
-      <w:sz w:val="32"/>
+      <w:sz w:val="40"/>
       <w:szCs w:val="52"/>
     </w:rPr>
   </w:style>

</xml_diff>